<commit_message>
Issue #5: update DPP document with   commands description
</commit_message>
<xml_diff>
--- a/doc/DPP_parameters.docx
+++ b/doc/DPP_parameters.docx
@@ -1660,7 +1660,650 @@
       </w:pPr>
       <w:r>
         <w:rPr/>
-        <w:t>Returns the values for each of the DPP parameters available in the MCA.</w:t>
+        <w:t>Returns the values f</w:t>
+      </w:r>
+      <w:r>
+        <w:rPr/>
+        <w:t>rom</w:t>
+      </w:r>
+      <w:r>
+        <w:rPr/>
+        <w:t xml:space="preserve"> </w:t>
+      </w:r>
+      <w:r>
+        <w:rPr/>
+        <w:t>a</w:t>
+      </w:r>
+      <w:r>
+        <w:rPr/>
+        <w:t xml:space="preserve"> </w:t>
+      </w:r>
+      <w:r>
+        <w:rPr/>
+        <w:t>specific</w:t>
+      </w:r>
+      <w:r>
+        <w:rPr/>
+        <w:t xml:space="preserve"> DPP parameters </w:t>
+      </w:r>
+      <w:r>
+        <w:rPr/>
+        <w:t xml:space="preserve">group </w:t>
+      </w:r>
+      <w:r>
+        <w:rPr/>
+        <w:t xml:space="preserve">in the MCA. </w:t>
+      </w:r>
+      <w:r>
+        <w:rPr/>
+        <w:t xml:space="preserve">Refer to the section </w:t>
+      </w:r>
+      <w:r>
+        <w:rPr/>
+        <w:fldChar w:fldCharType="begin"/>
+      </w:r>
+      <w:r>
+        <w:rPr/>
+        <w:instrText xml:space="preserve"> REF __RefHeading___Toc2092_1783282664 \h </w:instrText>
+      </w:r>
+      <w:r>
+        <w:rPr/>
+        <w:fldChar w:fldCharType="separate"/>
+      </w:r>
+      <w:r>
+        <w:rPr/>
+        <w:t>Digital pulse processor</w:t>
+      </w:r>
+      <w:r>
+        <w:rPr/>
+        <w:fldChar w:fldCharType="end"/>
+      </w:r>
+      <w:r>
+        <w:rPr/>
+        <w:t xml:space="preserve"> for details on the available options.</w:t>
+      </w:r>
+    </w:p>
+    <w:p>
+      <w:pPr>
+        <w:pStyle w:val="Heading3"/>
+        <w:ind w:hanging="0" w:start="0"/>
+        <w:rPr/>
+      </w:pPr>
+      <w:r>
+        <w:rPr/>
+        <w:t>Parameters</w:t>
+      </w:r>
+    </w:p>
+    <w:p>
+      <w:pPr>
+        <w:pStyle w:val="BodyText"/>
+        <w:rPr/>
+      </w:pPr>
+      <w:r>
+        <w:rPr/>
+        <w:t xml:space="preserve">Only one parameter is accepted: the DPP </w:t>
+      </w:r>
+      <w:r>
+        <w:rPr>
+          <w:u w:val="single"/>
+        </w:rPr>
+        <w:t>parameter group</w:t>
+      </w:r>
+      <w:r>
+        <w:rPr/>
+        <w:t xml:space="preserve"> index to be read. The available parameter groups are indexed as follows:</w:t>
+      </w:r>
+    </w:p>
+    <w:p>
+      <w:pPr>
+        <w:pStyle w:val="BodyText"/>
+        <w:numPr>
+          <w:ilvl w:val="0"/>
+          <w:numId w:val="3"/>
+        </w:numPr>
+        <w:rPr/>
+      </w:pPr>
+      <w:r>
+        <w:rPr/>
+        <w:fldChar w:fldCharType="begin"/>
+      </w:r>
+      <w:r>
+        <w:rPr/>
+        <w:instrText xml:space="preserve"> REF __RefHeading___Toc2096_1783282664 \h </w:instrText>
+      </w:r>
+      <w:r>
+        <w:rPr/>
+        <w:fldChar w:fldCharType="separate"/>
+      </w:r>
+      <w:r>
+        <w:rPr/>
+        <w:t>Pulse shaper – slow</w:t>
+      </w:r>
+      <w:r>
+        <w:rPr/>
+        <w:fldChar w:fldCharType="end"/>
+      </w:r>
+    </w:p>
+    <w:p>
+      <w:pPr>
+        <w:pStyle w:val="BodyText"/>
+        <w:numPr>
+          <w:ilvl w:val="0"/>
+          <w:numId w:val="3"/>
+        </w:numPr>
+        <w:rPr/>
+      </w:pPr>
+      <w:r>
+        <w:rPr/>
+        <w:fldChar w:fldCharType="begin"/>
+      </w:r>
+      <w:r>
+        <w:rPr/>
+        <w:instrText xml:space="preserve"> REF __RefHeading___Toc2098_1783282664 \h </w:instrText>
+      </w:r>
+      <w:r>
+        <w:rPr/>
+        <w:fldChar w:fldCharType="separate"/>
+      </w:r>
+      <w:r>
+        <w:rPr/>
+        <w:t>Peak detector – slow</w:t>
+      </w:r>
+      <w:r>
+        <w:rPr/>
+        <w:fldChar w:fldCharType="end"/>
+      </w:r>
+    </w:p>
+    <w:p>
+      <w:pPr>
+        <w:pStyle w:val="BodyText"/>
+        <w:numPr>
+          <w:ilvl w:val="0"/>
+          <w:numId w:val="3"/>
+        </w:numPr>
+        <w:rPr/>
+      </w:pPr>
+      <w:r>
+        <w:rPr/>
+        <w:fldChar w:fldCharType="begin"/>
+      </w:r>
+      <w:r>
+        <w:rPr/>
+        <w:instrText xml:space="preserve"> REF __RefHeading___Toc2100_1783282664 \h </w:instrText>
+      </w:r>
+      <w:r>
+        <w:rPr/>
+        <w:fldChar w:fldCharType="separate"/>
+      </w:r>
+      <w:r>
+        <w:rPr/>
+        <w:t>Scope</w:t>
+      </w:r>
+      <w:r>
+        <w:rPr/>
+        <w:fldChar w:fldCharType="end"/>
+      </w:r>
+    </w:p>
+    <w:p>
+      <w:pPr>
+        <w:pStyle w:val="BodyText"/>
+        <w:numPr>
+          <w:ilvl w:val="0"/>
+          <w:numId w:val="3"/>
+        </w:numPr>
+        <w:rPr/>
+      </w:pPr>
+      <w:r>
+        <w:rPr/>
+        <w:fldChar w:fldCharType="begin"/>
+      </w:r>
+      <w:r>
+        <w:rPr/>
+        <w:instrText xml:space="preserve"> REF __RefHeading___Toc2102_1783282664 \h </w:instrText>
+      </w:r>
+      <w:r>
+        <w:rPr/>
+        <w:fldChar w:fldCharType="separate"/>
+      </w:r>
+      <w:r>
+        <w:rPr/>
+        <w:t>Timers</w:t>
+      </w:r>
+      <w:r>
+        <w:rPr/>
+        <w:fldChar w:fldCharType="end"/>
+      </w:r>
+    </w:p>
+    <w:p>
+      <w:pPr>
+        <w:pStyle w:val="BodyText"/>
+        <w:numPr>
+          <w:ilvl w:val="0"/>
+          <w:numId w:val="3"/>
+        </w:numPr>
+        <w:rPr/>
+      </w:pPr>
+      <w:r>
+        <w:rPr/>
+        <w:fldChar w:fldCharType="begin"/>
+      </w:r>
+      <w:r>
+        <w:rPr/>
+        <w:instrText xml:space="preserve"> REF __RefHeading___Toc2104_1783282664 \h </w:instrText>
+      </w:r>
+      <w:r>
+        <w:rPr/>
+        <w:fldChar w:fldCharType="separate"/>
+      </w:r>
+      <w:r>
+        <w:rPr/>
+        <w:t>Baseline restorer - slow</w:t>
+      </w:r>
+      <w:r>
+        <w:rPr/>
+        <w:fldChar w:fldCharType="end"/>
+      </w:r>
+    </w:p>
+    <w:p>
+      <w:pPr>
+        <w:pStyle w:val="BodyText"/>
+        <w:numPr>
+          <w:ilvl w:val="0"/>
+          <w:numId w:val="3"/>
+        </w:numPr>
+        <w:rPr/>
+      </w:pPr>
+      <w:r>
+        <w:rPr/>
+        <w:fldChar w:fldCharType="begin"/>
+      </w:r>
+      <w:r>
+        <w:rPr/>
+        <w:instrText xml:space="preserve"> REF __RefHeading___Toc2106_1783282664 \h </w:instrText>
+      </w:r>
+      <w:r>
+        <w:rPr/>
+        <w:fldChar w:fldCharType="separate"/>
+      </w:r>
+      <w:r>
+        <w:rPr/>
+        <w:t>Scope mux</w:t>
+      </w:r>
+      <w:r>
+        <w:rPr/>
+        <w:fldChar w:fldCharType="end"/>
+      </w:r>
+    </w:p>
+    <w:p>
+      <w:pPr>
+        <w:pStyle w:val="BodyText"/>
+        <w:numPr>
+          <w:ilvl w:val="0"/>
+          <w:numId w:val="3"/>
+        </w:numPr>
+        <w:rPr/>
+      </w:pPr>
+      <w:r>
+        <w:rPr/>
+        <w:fldChar w:fldCharType="begin"/>
+      </w:r>
+      <w:r>
+        <w:rPr/>
+        <w:instrText xml:space="preserve"> REF __RefHeading___Toc2108_1783282664 \h </w:instrText>
+      </w:r>
+      <w:r>
+        <w:rPr/>
+        <w:fldChar w:fldCharType="separate"/>
+      </w:r>
+      <w:r>
+        <w:rPr/>
+        <w:t>DCS slow (deprecated)</w:t>
+      </w:r>
+      <w:r>
+        <w:rPr/>
+        <w:fldChar w:fldCharType="end"/>
+      </w:r>
+    </w:p>
+    <w:p>
+      <w:pPr>
+        <w:pStyle w:val="BodyText"/>
+        <w:numPr>
+          <w:ilvl w:val="0"/>
+          <w:numId w:val="3"/>
+        </w:numPr>
+        <w:rPr/>
+      </w:pPr>
+      <w:r>
+        <w:rPr/>
+        <w:fldChar w:fldCharType="begin"/>
+      </w:r>
+      <w:r>
+        <w:rPr/>
+        <w:instrText xml:space="preserve"> REF __RefHeading___Toc2110_1783282664 \h </w:instrText>
+      </w:r>
+      <w:r>
+        <w:rPr/>
+        <w:fldChar w:fldCharType="separate"/>
+      </w:r>
+      <w:r>
+        <w:rPr/>
+        <w:t>Formatter (preprocessing)</w:t>
+      </w:r>
+      <w:r>
+        <w:rPr/>
+        <w:fldChar w:fldCharType="end"/>
+      </w:r>
+    </w:p>
+    <w:p>
+      <w:pPr>
+        <w:pStyle w:val="BodyText"/>
+        <w:numPr>
+          <w:ilvl w:val="0"/>
+          <w:numId w:val="3"/>
+        </w:numPr>
+        <w:rPr/>
+      </w:pPr>
+      <w:r>
+        <w:rPr/>
+        <w:fldChar w:fldCharType="begin"/>
+      </w:r>
+      <w:r>
+        <w:rPr/>
+        <w:instrText xml:space="preserve"> REF __RefHeading___Toc2112_1783282664 \h </w:instrText>
+      </w:r>
+      <w:r>
+        <w:rPr/>
+        <w:fldChar w:fldCharType="separate"/>
+      </w:r>
+      <w:r>
+        <w:rPr/>
+        <w:t>Pulse shaper – fast</w:t>
+      </w:r>
+      <w:r>
+        <w:rPr/>
+        <w:fldChar w:fldCharType="end"/>
+      </w:r>
+    </w:p>
+    <w:p>
+      <w:pPr>
+        <w:pStyle w:val="BodyText"/>
+        <w:numPr>
+          <w:ilvl w:val="0"/>
+          <w:numId w:val="3"/>
+        </w:numPr>
+        <w:rPr/>
+      </w:pPr>
+      <w:r>
+        <w:rPr/>
+        <w:fldChar w:fldCharType="begin"/>
+      </w:r>
+      <w:r>
+        <w:rPr/>
+        <w:instrText xml:space="preserve"> REF __RefHeading___Toc2114_1783282664 \h </w:instrText>
+      </w:r>
+      <w:r>
+        <w:rPr/>
+        <w:fldChar w:fldCharType="separate"/>
+      </w:r>
+      <w:r>
+        <w:rPr/>
+        <w:t>Baseline restorer - fast</w:t>
+      </w:r>
+      <w:r>
+        <w:rPr/>
+        <w:fldChar w:fldCharType="end"/>
+      </w:r>
+    </w:p>
+    <w:p>
+      <w:pPr>
+        <w:pStyle w:val="BodyText"/>
+        <w:numPr>
+          <w:ilvl w:val="0"/>
+          <w:numId w:val="3"/>
+        </w:numPr>
+        <w:rPr/>
+      </w:pPr>
+      <w:r>
+        <w:rPr/>
+        <w:fldChar w:fldCharType="begin"/>
+      </w:r>
+      <w:r>
+        <w:rPr/>
+        <w:instrText xml:space="preserve"> REF __RefHeading___Toc2116_1783282664 \h </w:instrText>
+      </w:r>
+      <w:r>
+        <w:rPr/>
+        <w:fldChar w:fldCharType="separate"/>
+      </w:r>
+      <w:r>
+        <w:rPr/>
+        <w:t>DCS – fast (deprecated)</w:t>
+      </w:r>
+      <w:r>
+        <w:rPr/>
+        <w:fldChar w:fldCharType="end"/>
+      </w:r>
+    </w:p>
+    <w:p>
+      <w:pPr>
+        <w:pStyle w:val="BodyText"/>
+        <w:numPr>
+          <w:ilvl w:val="0"/>
+          <w:numId w:val="3"/>
+        </w:numPr>
+        <w:rPr/>
+      </w:pPr>
+      <w:r>
+        <w:rPr/>
+        <w:fldChar w:fldCharType="begin"/>
+      </w:r>
+      <w:r>
+        <w:rPr/>
+        <w:instrText xml:space="preserve"> REF __RefHeading___Toc2118_1783282664 \h </w:instrText>
+      </w:r>
+      <w:r>
+        <w:rPr/>
+        <w:fldChar w:fldCharType="separate"/>
+      </w:r>
+      <w:r>
+        <w:rPr/>
+        <w:t>Peak detector – fast</w:t>
+      </w:r>
+      <w:r>
+        <w:rPr/>
+        <w:fldChar w:fldCharType="end"/>
+      </w:r>
+    </w:p>
+    <w:p>
+      <w:pPr>
+        <w:pStyle w:val="BodyText"/>
+        <w:numPr>
+          <w:ilvl w:val="0"/>
+          <w:numId w:val="3"/>
+        </w:numPr>
+        <w:rPr/>
+      </w:pPr>
+      <w:r>
+        <w:rPr/>
+        <w:fldChar w:fldCharType="begin"/>
+      </w:r>
+      <w:r>
+        <w:rPr/>
+        <w:instrText xml:space="preserve"> REF __RefHeading___Toc2120_1783282664 \h </w:instrText>
+      </w:r>
+      <w:r>
+        <w:rPr/>
+        <w:fldChar w:fldCharType="separate"/>
+      </w:r>
+      <w:r>
+        <w:rPr/>
+        <w:t>Pileup rejector</w:t>
+      </w:r>
+      <w:r>
+        <w:rPr/>
+        <w:fldChar w:fldCharType="end"/>
+      </w:r>
+    </w:p>
+    <w:p>
+      <w:pPr>
+        <w:pStyle w:val="BodyText"/>
+        <w:numPr>
+          <w:ilvl w:val="0"/>
+          <w:numId w:val="3"/>
+        </w:numPr>
+        <w:rPr/>
+      </w:pPr>
+      <w:r>
+        <w:rPr/>
+        <w:fldChar w:fldCharType="begin"/>
+      </w:r>
+      <w:r>
+        <w:rPr/>
+        <w:instrText xml:space="preserve"> REF __RefHeading___Toc2122_1783282664 \h </w:instrText>
+      </w:r>
+      <w:r>
+        <w:rPr/>
+        <w:fldChar w:fldCharType="separate"/>
+      </w:r>
+      <w:r>
+        <w:rPr/>
+        <w:t>High Voltage (only for PMT version)</w:t>
+      </w:r>
+      <w:r>
+        <w:rPr/>
+        <w:fldChar w:fldCharType="end"/>
+      </w:r>
+    </w:p>
+    <w:p>
+      <w:pPr>
+        <w:pStyle w:val="BodyText"/>
+        <w:numPr>
+          <w:ilvl w:val="0"/>
+          <w:numId w:val="3"/>
+        </w:numPr>
+        <w:rPr/>
+      </w:pPr>
+      <w:r>
+        <w:rPr/>
+        <w:fldChar w:fldCharType="begin"/>
+      </w:r>
+      <w:r>
+        <w:rPr/>
+        <w:instrText xml:space="preserve"> REF __RefHeading___Toc2124_1783282664 \h </w:instrText>
+      </w:r>
+      <w:r>
+        <w:rPr/>
+        <w:fldChar w:fldCharType="separate"/>
+      </w:r>
+      <w:r>
+        <w:rPr/>
+        <w:t>Variable-gain analog amplifier</w:t>
+      </w:r>
+      <w:r>
+        <w:rPr/>
+        <w:fldChar w:fldCharType="end"/>
+      </w:r>
+    </w:p>
+    <w:p>
+      <w:pPr>
+        <w:pStyle w:val="Heading3"/>
+        <w:ind w:hanging="0" w:start="0"/>
+        <w:rPr/>
+      </w:pPr>
+      <w:r>
+        <w:rPr/>
+        <w:t>Example</w:t>
+      </w:r>
+    </w:p>
+    <w:p>
+      <w:pPr>
+        <w:pStyle w:val="BodyText"/>
+        <w:ind w:hanging="0" w:start="0"/>
+        <w:rPr/>
+      </w:pPr>
+      <w:r>
+        <w:rPr/>
+        <w:t>For instance, to retrieve the status of the Formatter (preprocessing) block, the parameter group #8 should be called:</w:t>
+      </w:r>
+    </w:p>
+    <w:p>
+      <w:pPr>
+        <w:pStyle w:val="Requestcommand"/>
+        <w:rPr/>
+      </w:pPr>
+      <w:r>
+        <w:rPr/>
+        <w:t>$</w:t>
+      </w:r>
+      <w:r>
+        <w:rPr/>
+        <w:t>GP 8</w:t>
+      </w:r>
+      <w:r>
+        <w:rPr/>
+        <w:t>\r</w:t>
+      </w:r>
+    </w:p>
+    <w:p>
+      <w:pPr>
+        <w:pStyle w:val="BodyText"/>
+        <w:ind w:hanging="0" w:start="0"/>
+        <w:rPr/>
+      </w:pPr>
+      <w:r>
+        <w:rPr/>
+        <w:br/>
+        <w:t>The expected reply should be something like this:</w:t>
+      </w:r>
+    </w:p>
+    <w:p>
+      <w:pPr>
+        <w:pStyle w:val="Replycommand"/>
+        <w:rPr/>
+      </w:pPr>
+      <w:r>
+        <w:rPr/>
+        <w:t>!GP 52921 0\n\r</w:t>
+      </w:r>
+    </w:p>
+    <w:p>
+      <w:pPr>
+        <w:pStyle w:val="Heading2"/>
+        <w:numPr>
+          <w:ilvl w:val="0"/>
+          <w:numId w:val="0"/>
+        </w:numPr>
+        <w:ind w:hanging="0" w:start="0"/>
+        <w:rPr>
+          <w:i w:val="false"/>
+          <w:iCs w:val="false"/>
+          <w:u w:val="single"/>
+        </w:rPr>
+      </w:pPr>
+      <w:r>
+        <w:rPr>
+          <w:i w:val="false"/>
+          <w:iCs w:val="false"/>
+          <w:u w:val="single"/>
+        </w:rPr>
+      </w:r>
+    </w:p>
+    <w:p>
+      <w:pPr>
+        <w:pStyle w:val="BodyText"/>
+        <w:ind w:hanging="0" w:start="0"/>
+        <w:rPr>
+          <w:i w:val="false"/>
+          <w:iCs w:val="false"/>
+          <w:u w:val="single"/>
+        </w:rPr>
+      </w:pPr>
+      <w:r>
+        <w:rPr>
+          <w:i w:val="false"/>
+          <w:iCs w:val="false"/>
+          <w:u w:val="single"/>
+        </w:rPr>
       </w:r>
     </w:p>
     <w:p>
@@ -1732,7 +2375,87 @@
       </w:pPr>
       <w:r>
         <w:rPr/>
-        <w:t>Asdf</w:t>
+        <w:t>Reads the current status/value of one or all the timers in the MCA.</w:t>
+      </w:r>
+    </w:p>
+    <w:p>
+      <w:pPr>
+        <w:pStyle w:val="Heading3"/>
+        <w:ind w:hanging="0" w:start="0"/>
+        <w:rPr/>
+      </w:pPr>
+      <w:r>
+        <w:rPr/>
+        <w:t>Parameters</w:t>
+      </w:r>
+    </w:p>
+    <w:p>
+      <w:pPr>
+        <w:pStyle w:val="BodyText"/>
+        <w:rPr/>
+      </w:pPr>
+      <w:r>
+        <w:rPr/>
+        <w:t>The timer index (address) to be read.</w:t>
+      </w:r>
+    </w:p>
+    <w:p>
+      <w:pPr>
+        <w:pStyle w:val="BodyText"/>
+        <w:rPr/>
+      </w:pPr>
+      <w:r>
+        <w:rPr/>
+        <w:t>Special case: to read all the timers simultaneously use -1. The reply will include the following fields:</w:t>
+      </w:r>
+    </w:p>
+    <w:p>
+      <w:pPr>
+        <w:pStyle w:val="BodyText"/>
+        <w:rPr/>
+      </w:pPr>
+      <w:r>
+        <w:rPr/>
+        <w:t>Timer A, Timer B, Timer C, Status Register, Preset (collection time), Control bits (flags)</w:t>
+      </w:r>
+    </w:p>
+    <w:p>
+      <w:pPr>
+        <w:pStyle w:val="Heading3"/>
+        <w:ind w:hanging="0" w:start="0"/>
+        <w:rPr/>
+      </w:pPr>
+      <w:r>
+        <w:rPr/>
+        <w:t>Example</w:t>
+      </w:r>
+    </w:p>
+    <w:p>
+      <w:pPr>
+        <w:pStyle w:val="Requestcommand"/>
+        <w:rPr/>
+      </w:pPr>
+      <w:r>
+        <w:rPr/>
+        <w:t>$</w:t>
+      </w:r>
+      <w:r>
+        <w:rPr/>
+        <w:t>RT -1</w:t>
+      </w:r>
+      <w:r>
+        <w:rPr/>
+        <w:t>\r</w:t>
+      </w:r>
+    </w:p>
+    <w:p>
+      <w:pPr>
+        <w:pStyle w:val="Replycommand"/>
+        <w:rPr/>
+      </w:pPr>
+      <w:r>
+        <w:rPr/>
+        <w:t>!RT 60000 60005 60000 4 300000 244\n\r</w:t>
       </w:r>
     </w:p>
     <w:p>
@@ -1802,11 +2525,72 @@
     <w:p>
       <w:pPr>
         <w:pStyle w:val="BodyText"/>
+        <w:bidi w:val="0"/>
         <w:rPr/>
       </w:pPr>
       <w:r>
         <w:rPr/>
-        <w:t>Asdf</w:t>
+        <w:t>Reads the BRAM memory values where the spectrum is stored. The reply command contains the !R\n\r header, followed by exactly 8 KB of binary data. The binary data represents the 2048 channels of the spectrum in unsigned 32-bit representation (little endian coding).</w:t>
+      </w:r>
+    </w:p>
+    <w:p>
+      <w:pPr>
+        <w:pStyle w:val="Heading3"/>
+        <w:ind w:hanging="0" w:start="0"/>
+        <w:rPr/>
+      </w:pPr>
+      <w:r>
+        <w:rPr/>
+        <w:t>Parameters</w:t>
+      </w:r>
+    </w:p>
+    <w:p>
+      <w:pPr>
+        <w:pStyle w:val="BodyText"/>
+        <w:rPr/>
+      </w:pPr>
+      <w:r>
+        <w:rPr/>
+        <w:t>The base address of the memory to read the spectrum from. The current version supports only 0.</w:t>
+      </w:r>
+    </w:p>
+    <w:p>
+      <w:pPr>
+        <w:pStyle w:val="Heading3"/>
+        <w:ind w:hanging="0" w:start="0"/>
+        <w:rPr/>
+      </w:pPr>
+      <w:r>
+        <w:rPr/>
+        <w:t>Example</w:t>
+      </w:r>
+    </w:p>
+    <w:p>
+      <w:pPr>
+        <w:pStyle w:val="Requestcommand"/>
+        <w:rPr/>
+      </w:pPr>
+      <w:r>
+        <w:rPr/>
+        <w:t>$</w:t>
+      </w:r>
+      <w:r>
+        <w:rPr/>
+        <w:t>RM 0</w:t>
+      </w:r>
+      <w:r>
+        <w:rPr/>
+        <w:t>\r</w:t>
+      </w:r>
+    </w:p>
+    <w:p>
+      <w:pPr>
+        <w:pStyle w:val="Replycommand"/>
+        <w:rPr/>
+      </w:pPr>
+      <w:r>
+        <w:rPr/>
+        <w:t>!R\n\r [8 KB of binary data: 32-bit words in little endian]</w:t>
       </w:r>
     </w:p>
     <w:p>
@@ -1876,11 +2660,107 @@
     <w:p>
       <w:pPr>
         <w:pStyle w:val="BodyText"/>
+        <w:bidi w:val="0"/>
         <w:rPr/>
       </w:pPr>
       <w:r>
         <w:rPr/>
-        <w:t>Asdf</w:t>
+        <w:t xml:space="preserve">Reads the two channels (signed 16-bit each) of the oscilloscope (CH1 and CH2). The data is replied from the MCA in a 32-bit binary (little endian) data stream. CH1 is stored in the first 16 bits, while CH2 can be retrieved by reading the most significant 16 bits. The length of the serial stream is determined by the BRAM Size parameter (see the subsection </w:t>
+      </w:r>
+      <w:r>
+        <w:rPr/>
+        <w:fldChar w:fldCharType="begin"/>
+      </w:r>
+      <w:r>
+        <w:rPr/>
+        <w:instrText xml:space="preserve"> REF __RefHeading___Toc2100_1783282664 \h </w:instrText>
+      </w:r>
+      <w:r>
+        <w:rPr/>
+        <w:fldChar w:fldCharType="separate"/>
+      </w:r>
+      <w:r>
+        <w:rPr/>
+        <w:t>Scope</w:t>
+      </w:r>
+      <w:r>
+        <w:rPr/>
+        <w:fldChar w:fldCharType="end"/>
+      </w:r>
+      <w:r>
+        <w:rPr/>
+        <w:t>), by default 2048 samples.</w:t>
+      </w:r>
+    </w:p>
+    <w:p>
+      <w:pPr>
+        <w:pStyle w:val="BodyText"/>
+        <w:bidi w:val="0"/>
+        <w:rPr/>
+      </w:pPr>
+      <w:r>
+        <w:rPr/>
+        <w:t>With the default configuration, 8 KB (2048 samples for the 2 channels in 32-bit words) is streamed from the MCA to the host.</w:t>
+      </w:r>
+    </w:p>
+    <w:p>
+      <w:pPr>
+        <w:pStyle w:val="Heading3"/>
+        <w:ind w:hanging="0" w:start="0"/>
+        <w:rPr/>
+      </w:pPr>
+      <w:r>
+        <w:rPr/>
+        <w:t>Parameters</w:t>
+      </w:r>
+    </w:p>
+    <w:p>
+      <w:pPr>
+        <w:pStyle w:val="BodyText"/>
+        <w:rPr/>
+      </w:pPr>
+      <w:r>
+        <w:rPr/>
+        <w:t>No parameters are required.</w:t>
+      </w:r>
+    </w:p>
+    <w:p>
+      <w:pPr>
+        <w:pStyle w:val="Heading3"/>
+        <w:ind w:hanging="0" w:start="0"/>
+        <w:rPr/>
+      </w:pPr>
+      <w:r>
+        <w:rPr/>
+        <w:t>Example</w:t>
+      </w:r>
+    </w:p>
+    <w:p>
+      <w:pPr>
+        <w:pStyle w:val="Requestcommand"/>
+        <w:rPr/>
+      </w:pPr>
+      <w:r>
+        <w:rPr/>
+        <w:t>$</w:t>
+      </w:r>
+      <w:r>
+        <w:rPr/>
+        <w:t>LS</w:t>
+      </w:r>
+      <w:r>
+        <w:rPr/>
+        <w:t>\r</w:t>
+      </w:r>
+    </w:p>
+    <w:p>
+      <w:pPr>
+        <w:pStyle w:val="Replycommand"/>
+        <w:rPr/>
+      </w:pPr>
+      <w:r>
+        <w:rPr/>
+        <w:t>!L\n\r [8 KB of binary data: 32-bit words in little endian]</w:t>
       </w:r>
     </w:p>
     <w:p>
@@ -1946,7 +2826,682 @@
       </w:pPr>
       <w:r>
         <w:rPr/>
-        <w:t>Asdf</w:t>
+        <w:t>Sets</w:t>
+      </w:r>
+      <w:r>
+        <w:rPr/>
+        <w:t xml:space="preserve"> the values for </w:t>
+      </w:r>
+      <w:r>
+        <w:rPr/>
+        <w:t>a group</w:t>
+      </w:r>
+      <w:r>
+        <w:rPr/>
+        <w:t xml:space="preserve"> of the DPP parameters in the MCA. </w:t>
+      </w:r>
+      <w:r>
+        <w:rPr/>
+        <w:t xml:space="preserve">Refer to the section </w:t>
+      </w:r>
+      <w:r>
+        <w:rPr/>
+        <w:fldChar w:fldCharType="begin"/>
+      </w:r>
+      <w:r>
+        <w:rPr/>
+        <w:instrText xml:space="preserve"> REF __RefHeading___Toc2092_1783282664 \h </w:instrText>
+      </w:r>
+      <w:r>
+        <w:rPr/>
+        <w:fldChar w:fldCharType="separate"/>
+      </w:r>
+      <w:r>
+        <w:rPr/>
+        <w:t>Digital pulse processor</w:t>
+      </w:r>
+      <w:r>
+        <w:rPr/>
+        <w:fldChar w:fldCharType="end"/>
+      </w:r>
+      <w:r>
+        <w:rPr/>
+        <w:t xml:space="preserve"> for details on the available options.</w:t>
+      </w:r>
+    </w:p>
+    <w:p>
+      <w:pPr>
+        <w:pStyle w:val="Heading3"/>
+        <w:ind w:hanging="0" w:start="0"/>
+        <w:rPr/>
+      </w:pPr>
+      <w:r>
+        <w:rPr/>
+        <w:t>Parameters</w:t>
+      </w:r>
+    </w:p>
+    <w:p>
+      <w:pPr>
+        <w:pStyle w:val="BodyText"/>
+        <w:rPr/>
+      </w:pPr>
+      <w:r>
+        <w:rPr/>
+        <w:t>The first parameter is the DPP parameter group index, followed by the values of the corresponding parameter group.</w:t>
+      </w:r>
+      <w:r>
+        <w:rPr/>
+        <w:t xml:space="preserve"> </w:t>
+      </w:r>
+      <w:r>
+        <w:rPr/>
+        <w:t>T</w:t>
+      </w:r>
+      <w:r>
+        <w:rPr/>
+        <w:t xml:space="preserve">he DPP </w:t>
+      </w:r>
+      <w:r>
+        <w:rPr>
+          <w:u w:val="single"/>
+        </w:rPr>
+        <w:t>parameter group</w:t>
+      </w:r>
+      <w:r>
+        <w:rPr/>
+        <w:t xml:space="preserve"> index </w:t>
+      </w:r>
+      <w:r>
+        <w:rPr/>
+        <w:t>is shown next</w:t>
+      </w:r>
+      <w:r>
+        <w:rPr/>
+        <w:t>:</w:t>
+      </w:r>
+    </w:p>
+    <w:p>
+      <w:pPr>
+        <w:pStyle w:val="BodyText"/>
+        <w:numPr>
+          <w:ilvl w:val="0"/>
+          <w:numId w:val="4"/>
+        </w:numPr>
+        <w:rPr/>
+      </w:pPr>
+      <w:r>
+        <w:rPr/>
+        <w:fldChar w:fldCharType="begin"/>
+      </w:r>
+      <w:r>
+        <w:rPr/>
+        <w:instrText xml:space="preserve"> REF __RefHeading___Toc2096_1783282664 \h </w:instrText>
+      </w:r>
+      <w:r>
+        <w:rPr/>
+        <w:fldChar w:fldCharType="separate"/>
+      </w:r>
+      <w:r>
+        <w:rPr/>
+        <w:t>Pulse shaper – slow</w:t>
+      </w:r>
+      <w:r>
+        <w:rPr/>
+        <w:fldChar w:fldCharType="end"/>
+      </w:r>
+    </w:p>
+    <w:p>
+      <w:pPr>
+        <w:pStyle w:val="BodyText"/>
+        <w:numPr>
+          <w:ilvl w:val="0"/>
+          <w:numId w:val="4"/>
+        </w:numPr>
+        <w:rPr/>
+      </w:pPr>
+      <w:r>
+        <w:rPr/>
+        <w:fldChar w:fldCharType="begin"/>
+      </w:r>
+      <w:r>
+        <w:rPr/>
+        <w:instrText xml:space="preserve"> REF __RefHeading___Toc2098_1783282664 \h </w:instrText>
+      </w:r>
+      <w:r>
+        <w:rPr/>
+        <w:fldChar w:fldCharType="separate"/>
+      </w:r>
+      <w:r>
+        <w:rPr/>
+        <w:t>Peak detector – slow</w:t>
+      </w:r>
+      <w:r>
+        <w:rPr/>
+        <w:fldChar w:fldCharType="end"/>
+      </w:r>
+    </w:p>
+    <w:p>
+      <w:pPr>
+        <w:pStyle w:val="BodyText"/>
+        <w:numPr>
+          <w:ilvl w:val="0"/>
+          <w:numId w:val="4"/>
+        </w:numPr>
+        <w:rPr/>
+      </w:pPr>
+      <w:r>
+        <w:rPr/>
+        <w:fldChar w:fldCharType="begin"/>
+      </w:r>
+      <w:r>
+        <w:rPr/>
+        <w:instrText xml:space="preserve"> REF __RefHeading___Toc2100_1783282664 \h </w:instrText>
+      </w:r>
+      <w:r>
+        <w:rPr/>
+        <w:fldChar w:fldCharType="separate"/>
+      </w:r>
+      <w:r>
+        <w:rPr/>
+        <w:t>Scope</w:t>
+      </w:r>
+      <w:r>
+        <w:rPr/>
+        <w:fldChar w:fldCharType="end"/>
+      </w:r>
+    </w:p>
+    <w:p>
+      <w:pPr>
+        <w:pStyle w:val="BodyText"/>
+        <w:numPr>
+          <w:ilvl w:val="0"/>
+          <w:numId w:val="4"/>
+        </w:numPr>
+        <w:rPr/>
+      </w:pPr>
+      <w:r>
+        <w:rPr/>
+        <w:fldChar w:fldCharType="begin"/>
+      </w:r>
+      <w:r>
+        <w:rPr/>
+        <w:instrText xml:space="preserve"> REF __RefHeading___Toc2102_1783282664 \h </w:instrText>
+      </w:r>
+      <w:r>
+        <w:rPr/>
+        <w:fldChar w:fldCharType="separate"/>
+      </w:r>
+      <w:r>
+        <w:rPr/>
+        <w:t>Timers</w:t>
+      </w:r>
+      <w:r>
+        <w:rPr/>
+        <w:fldChar w:fldCharType="end"/>
+      </w:r>
+    </w:p>
+    <w:p>
+      <w:pPr>
+        <w:pStyle w:val="BodyText"/>
+        <w:numPr>
+          <w:ilvl w:val="0"/>
+          <w:numId w:val="4"/>
+        </w:numPr>
+        <w:rPr/>
+      </w:pPr>
+      <w:r>
+        <w:rPr/>
+        <w:fldChar w:fldCharType="begin"/>
+      </w:r>
+      <w:r>
+        <w:rPr/>
+        <w:instrText xml:space="preserve"> REF __RefHeading___Toc2104_1783282664 \h </w:instrText>
+      </w:r>
+      <w:r>
+        <w:rPr/>
+        <w:fldChar w:fldCharType="separate"/>
+      </w:r>
+      <w:r>
+        <w:rPr/>
+        <w:t>Baseline restorer - slow</w:t>
+      </w:r>
+      <w:r>
+        <w:rPr/>
+        <w:fldChar w:fldCharType="end"/>
+      </w:r>
+    </w:p>
+    <w:p>
+      <w:pPr>
+        <w:pStyle w:val="BodyText"/>
+        <w:numPr>
+          <w:ilvl w:val="0"/>
+          <w:numId w:val="4"/>
+        </w:numPr>
+        <w:rPr/>
+      </w:pPr>
+      <w:r>
+        <w:rPr/>
+        <w:fldChar w:fldCharType="begin"/>
+      </w:r>
+      <w:r>
+        <w:rPr/>
+        <w:instrText xml:space="preserve"> REF __RefHeading___Toc2106_1783282664 \h </w:instrText>
+      </w:r>
+      <w:r>
+        <w:rPr/>
+        <w:fldChar w:fldCharType="separate"/>
+      </w:r>
+      <w:r>
+        <w:rPr/>
+        <w:t>Scope mux</w:t>
+      </w:r>
+      <w:r>
+        <w:rPr/>
+        <w:fldChar w:fldCharType="end"/>
+      </w:r>
+    </w:p>
+    <w:p>
+      <w:pPr>
+        <w:pStyle w:val="BodyText"/>
+        <w:numPr>
+          <w:ilvl w:val="0"/>
+          <w:numId w:val="4"/>
+        </w:numPr>
+        <w:rPr/>
+      </w:pPr>
+      <w:r>
+        <w:rPr/>
+        <w:fldChar w:fldCharType="begin"/>
+      </w:r>
+      <w:r>
+        <w:rPr/>
+        <w:instrText xml:space="preserve"> REF __RefHeading___Toc2108_1783282664 \h </w:instrText>
+      </w:r>
+      <w:r>
+        <w:rPr/>
+        <w:fldChar w:fldCharType="separate"/>
+      </w:r>
+      <w:r>
+        <w:rPr/>
+        <w:t>DCS slow (deprecated)</w:t>
+      </w:r>
+      <w:r>
+        <w:rPr/>
+        <w:fldChar w:fldCharType="end"/>
+      </w:r>
+    </w:p>
+    <w:p>
+      <w:pPr>
+        <w:pStyle w:val="BodyText"/>
+        <w:numPr>
+          <w:ilvl w:val="0"/>
+          <w:numId w:val="4"/>
+        </w:numPr>
+        <w:rPr/>
+      </w:pPr>
+      <w:r>
+        <w:rPr/>
+        <w:fldChar w:fldCharType="begin"/>
+      </w:r>
+      <w:r>
+        <w:rPr/>
+        <w:instrText xml:space="preserve"> REF __RefHeading___Toc2110_1783282664 \h </w:instrText>
+      </w:r>
+      <w:r>
+        <w:rPr/>
+        <w:fldChar w:fldCharType="separate"/>
+      </w:r>
+      <w:r>
+        <w:rPr/>
+        <w:t>Formatter (preprocessing)</w:t>
+      </w:r>
+      <w:r>
+        <w:rPr/>
+        <w:fldChar w:fldCharType="end"/>
+      </w:r>
+    </w:p>
+    <w:p>
+      <w:pPr>
+        <w:pStyle w:val="BodyText"/>
+        <w:numPr>
+          <w:ilvl w:val="0"/>
+          <w:numId w:val="4"/>
+        </w:numPr>
+        <w:rPr/>
+      </w:pPr>
+      <w:r>
+        <w:rPr/>
+        <w:fldChar w:fldCharType="begin"/>
+      </w:r>
+      <w:r>
+        <w:rPr/>
+        <w:instrText xml:space="preserve"> REF __RefHeading___Toc2112_1783282664 \h </w:instrText>
+      </w:r>
+      <w:r>
+        <w:rPr/>
+        <w:fldChar w:fldCharType="separate"/>
+      </w:r>
+      <w:r>
+        <w:rPr/>
+        <w:t>Pulse shaper – fast</w:t>
+      </w:r>
+      <w:r>
+        <w:rPr/>
+        <w:fldChar w:fldCharType="end"/>
+      </w:r>
+    </w:p>
+    <w:p>
+      <w:pPr>
+        <w:pStyle w:val="BodyText"/>
+        <w:numPr>
+          <w:ilvl w:val="0"/>
+          <w:numId w:val="4"/>
+        </w:numPr>
+        <w:rPr/>
+      </w:pPr>
+      <w:r>
+        <w:rPr/>
+        <w:fldChar w:fldCharType="begin"/>
+      </w:r>
+      <w:r>
+        <w:rPr/>
+        <w:instrText xml:space="preserve"> REF __RefHeading___Toc2114_1783282664 \h </w:instrText>
+      </w:r>
+      <w:r>
+        <w:rPr/>
+        <w:fldChar w:fldCharType="separate"/>
+      </w:r>
+      <w:r>
+        <w:rPr/>
+        <w:t>Baseline restorer - fast</w:t>
+      </w:r>
+      <w:r>
+        <w:rPr/>
+        <w:fldChar w:fldCharType="end"/>
+      </w:r>
+    </w:p>
+    <w:p>
+      <w:pPr>
+        <w:pStyle w:val="BodyText"/>
+        <w:numPr>
+          <w:ilvl w:val="0"/>
+          <w:numId w:val="4"/>
+        </w:numPr>
+        <w:rPr/>
+      </w:pPr>
+      <w:r>
+        <w:rPr/>
+        <w:fldChar w:fldCharType="begin"/>
+      </w:r>
+      <w:r>
+        <w:rPr/>
+        <w:instrText xml:space="preserve"> REF __RefHeading___Toc2116_1783282664 \h </w:instrText>
+      </w:r>
+      <w:r>
+        <w:rPr/>
+        <w:fldChar w:fldCharType="separate"/>
+      </w:r>
+      <w:r>
+        <w:rPr/>
+        <w:t>DCS – fast (deprecated)</w:t>
+      </w:r>
+      <w:r>
+        <w:rPr/>
+        <w:fldChar w:fldCharType="end"/>
+      </w:r>
+    </w:p>
+    <w:p>
+      <w:pPr>
+        <w:pStyle w:val="BodyText"/>
+        <w:numPr>
+          <w:ilvl w:val="0"/>
+          <w:numId w:val="4"/>
+        </w:numPr>
+        <w:rPr/>
+      </w:pPr>
+      <w:r>
+        <w:rPr/>
+        <w:fldChar w:fldCharType="begin"/>
+      </w:r>
+      <w:r>
+        <w:rPr/>
+        <w:instrText xml:space="preserve"> REF __RefHeading___Toc2118_1783282664 \h </w:instrText>
+      </w:r>
+      <w:r>
+        <w:rPr/>
+        <w:fldChar w:fldCharType="separate"/>
+      </w:r>
+      <w:r>
+        <w:rPr/>
+        <w:t>Peak detector – fast</w:t>
+      </w:r>
+      <w:r>
+        <w:rPr/>
+        <w:fldChar w:fldCharType="end"/>
+      </w:r>
+    </w:p>
+    <w:p>
+      <w:pPr>
+        <w:pStyle w:val="BodyText"/>
+        <w:numPr>
+          <w:ilvl w:val="0"/>
+          <w:numId w:val="4"/>
+        </w:numPr>
+        <w:rPr/>
+      </w:pPr>
+      <w:r>
+        <w:rPr/>
+        <w:fldChar w:fldCharType="begin"/>
+      </w:r>
+      <w:r>
+        <w:rPr/>
+        <w:instrText xml:space="preserve"> REF __RefHeading___Toc2120_1783282664 \h </w:instrText>
+      </w:r>
+      <w:r>
+        <w:rPr/>
+        <w:fldChar w:fldCharType="separate"/>
+      </w:r>
+      <w:r>
+        <w:rPr/>
+        <w:t>Pileup rejector</w:t>
+      </w:r>
+      <w:r>
+        <w:rPr/>
+        <w:fldChar w:fldCharType="end"/>
+      </w:r>
+    </w:p>
+    <w:p>
+      <w:pPr>
+        <w:pStyle w:val="BodyText"/>
+        <w:numPr>
+          <w:ilvl w:val="0"/>
+          <w:numId w:val="4"/>
+        </w:numPr>
+        <w:rPr/>
+      </w:pPr>
+      <w:r>
+        <w:rPr/>
+        <w:fldChar w:fldCharType="begin"/>
+      </w:r>
+      <w:r>
+        <w:rPr/>
+        <w:instrText xml:space="preserve"> REF __RefHeading___Toc2122_1783282664 \h </w:instrText>
+      </w:r>
+      <w:r>
+        <w:rPr/>
+        <w:fldChar w:fldCharType="separate"/>
+      </w:r>
+      <w:r>
+        <w:rPr/>
+        <w:t>High Voltage (only for PMT version)</w:t>
+      </w:r>
+      <w:r>
+        <w:rPr/>
+        <w:fldChar w:fldCharType="end"/>
+      </w:r>
+    </w:p>
+    <w:p>
+      <w:pPr>
+        <w:pStyle w:val="BodyText"/>
+        <w:numPr>
+          <w:ilvl w:val="0"/>
+          <w:numId w:val="4"/>
+        </w:numPr>
+        <w:rPr/>
+      </w:pPr>
+      <w:r>
+        <w:rPr/>
+        <w:fldChar w:fldCharType="begin"/>
+      </w:r>
+      <w:r>
+        <w:rPr/>
+        <w:instrText xml:space="preserve"> REF __RefHeading___Toc2124_1783282664 \h </w:instrText>
+      </w:r>
+      <w:r>
+        <w:rPr/>
+        <w:fldChar w:fldCharType="separate"/>
+      </w:r>
+      <w:r>
+        <w:rPr/>
+        <w:t>Variable-gain analog amplifier</w:t>
+      </w:r>
+      <w:r>
+        <w:rPr/>
+        <w:fldChar w:fldCharType="end"/>
+      </w:r>
+    </w:p>
+    <w:p>
+      <w:pPr>
+        <w:pStyle w:val="Heading3"/>
+        <w:ind w:hanging="0" w:start="0"/>
+        <w:rPr/>
+      </w:pPr>
+      <w:r>
+        <w:rPr/>
+        <w:t>Example</w:t>
+      </w:r>
+    </w:p>
+    <w:p>
+      <w:pPr>
+        <w:pStyle w:val="BodyText"/>
+        <w:ind w:hanging="0" w:start="0"/>
+        <w:rPr/>
+      </w:pPr>
+      <w:r>
+        <w:rPr/>
+        <w:t xml:space="preserve">For instance, to </w:t>
+      </w:r>
+      <w:r>
+        <w:rPr/>
+        <w:t>set</w:t>
+      </w:r>
+      <w:r>
+        <w:rPr/>
+        <w:t xml:space="preserve"> the </w:t>
+      </w:r>
+      <w:r>
+        <w:rPr/>
+        <w:t>values for the Pulse Shaper Slow (DPP parameter group 1):</w:t>
+      </w:r>
+    </w:p>
+    <w:p>
+      <w:pPr>
+        <w:pStyle w:val="Requestcommand"/>
+        <w:rPr/>
+      </w:pPr>
+      <w:r>
+        <w:rPr/>
+        <w:t>$</w:t>
+      </w:r>
+      <w:r>
+        <w:rPr/>
+        <w:t>SP 1 20 220 1145 2500 1000 33554432 32973417 2097 122 172 16443768 0 0 15319287 0 0 0</w:t>
+      </w:r>
+      <w:r>
+        <w:rPr/>
+        <w:t>\n\r</w:t>
+      </w:r>
+    </w:p>
+    <w:p>
+      <w:pPr>
+        <w:pStyle w:val="BodyText"/>
+        <w:ind w:hanging="0" w:start="0"/>
+        <w:rPr/>
+      </w:pPr>
+      <w:r>
+        <w:rPr/>
+        <w:t>The expected reply should be something like this:</w:t>
+        <w:br/>
+      </w:r>
+      <w:r>
+        <w:rPr>
+          <w:rFonts w:eastAsia="Noto Sans Mono CJK SC" w:cs="Liberation Mono" w:ascii="Liberation Mono" w:hAnsi="Liberation Mono"/>
+          <w:b w:val="false"/>
+          <w:color w:val="B9222C"/>
+          <w:kern w:val="2"/>
+          <w:sz w:val="24"/>
+          <w:szCs w:val="20"/>
+          <w:lang w:val="en-US" w:eastAsia="zh-CN" w:bidi="hi-IN"/>
+        </w:rPr>
+        <w:t>!SP</w:t>
+      </w:r>
+    </w:p>
+    <w:p>
+      <w:pPr>
+        <w:pStyle w:val="BodyText"/>
+        <w:ind w:hanging="0" w:start="0"/>
+        <w:rPr/>
+      </w:pPr>
+      <w:r>
+        <w:rPr/>
+      </w:r>
+    </w:p>
+    <w:p>
+      <w:pPr>
+        <w:pStyle w:val="BodyText"/>
+        <w:bidi w:val="0"/>
+        <w:ind w:hanging="0" w:start="0"/>
+        <w:rPr/>
+      </w:pPr>
+      <w:r>
+        <w:rPr/>
+        <w:t>Another example involves a parameter group with less fields/values: the Pileup Rejector (DPP parameter group 13):</w:t>
+      </w:r>
+    </w:p>
+    <w:p>
+      <w:pPr>
+        <w:pStyle w:val="Requestcommand"/>
+        <w:rPr/>
+      </w:pPr>
+      <w:r>
+        <w:rPr/>
+        <w:t>$SP 13 237 1 20\n\r</w:t>
+      </w:r>
+    </w:p>
+    <w:p>
+      <w:pPr>
+        <w:pStyle w:val="BodyText"/>
+        <w:ind w:hanging="0" w:start="0"/>
+        <w:rPr/>
+      </w:pPr>
+      <w:r>
+        <w:rPr/>
+        <w:br/>
+        <w:t>The expected reply should be something like this:</w:t>
+      </w:r>
+    </w:p>
+    <w:p>
+      <w:pPr>
+        <w:pStyle w:val="Replycommand"/>
+        <w:rPr/>
+      </w:pPr>
+      <w:r>
+        <w:rPr/>
+        <w:t>!</w:t>
+      </w:r>
+      <w:r>
+        <w:rPr/>
+        <w:t>SP</w:t>
       </w:r>
     </w:p>
     <w:p>
@@ -2028,7 +3583,7 @@
       </w:pPr>
       <w:r>
         <w:rPr/>
-        <w:t>Asdf</w:t>
+        <w:t>Sets the spectrum acquisition status.</w:t>
       </w:r>
     </w:p>
     <w:p>
@@ -2102,7 +3657,7 @@
       </w:pPr>
       <w:r>
         <w:rPr/>
-        <w:t>Asdf</w:t>
+        <w:t>Clears the memory contents where the spectrum is stored.</w:t>
       </w:r>
     </w:p>
     <w:p>
@@ -2168,7 +3723,7 @@
       </w:pPr>
       <w:r>
         <w:rPr/>
-        <w:t>Asdf</w:t>
+        <w:t xml:space="preserve">Not implemented yet. </w:t>
       </w:r>
     </w:p>
     <w:p>
@@ -2236,6 +3791,8 @@
         <w:ind w:hanging="0" w:start="0"/>
         <w:rPr/>
       </w:pPr>
+      <w:bookmarkStart w:id="1" w:name="__RefHeading___Toc2092_1783282664"/>
+      <w:bookmarkEnd w:id="1"/>
       <w:r>
         <w:rPr/>
         <w:t>Digital pulse processor</w:t>
@@ -2320,6 +3877,8 @@
         <w:ind w:hanging="0" w:start="0"/>
         <w:rPr/>
       </w:pPr>
+      <w:bookmarkStart w:id="2" w:name="__RefHeading___Toc2096_1783282664"/>
+      <w:bookmarkEnd w:id="2"/>
       <w:r>
         <w:rPr/>
         <w:t>Pulse shaper – slow</w:t>
@@ -2356,9 +3915,9 @@
       </w:tblPr>
       <w:tblGrid>
         <w:gridCol w:w="1350"/>
-        <w:gridCol w:w="2931"/>
+        <w:gridCol w:w="2930"/>
         <w:gridCol w:w="1800"/>
-        <w:gridCol w:w="1353"/>
+        <w:gridCol w:w="1354"/>
         <w:gridCol w:w="2538"/>
       </w:tblGrid>
       <w:tr>
@@ -2402,7 +3961,7 @@
         </w:tc>
         <w:tc>
           <w:tcPr>
-            <w:tcW w:w="2931" w:type="dxa"/>
+            <w:tcW w:w="2930" w:type="dxa"/>
             <w:tcBorders>
               <w:top w:val="single" w:sz="4" w:space="0" w:color="000000"/>
               <w:start w:val="single" w:sz="4" w:space="0" w:color="000000"/>
@@ -2476,7 +4035,7 @@
         </w:tc>
         <w:tc>
           <w:tcPr>
-            <w:tcW w:w="1353" w:type="dxa"/>
+            <w:tcW w:w="1354" w:type="dxa"/>
             <w:tcBorders>
               <w:top w:val="single" w:sz="4" w:space="0" w:color="000000"/>
               <w:start w:val="single" w:sz="4" w:space="0" w:color="000000"/>
@@ -2601,7 +4160,7 @@
         </w:tc>
         <w:tc>
           <w:tcPr>
-            <w:tcW w:w="2931" w:type="dxa"/>
+            <w:tcW w:w="2930" w:type="dxa"/>
             <w:tcBorders>
               <w:start w:val="single" w:sz="4" w:space="0" w:color="000000"/>
               <w:bottom w:val="single" w:sz="4" w:space="0" w:color="000000"/>
@@ -2729,7 +4288,7 @@
         </w:tc>
         <w:tc>
           <w:tcPr>
-            <w:tcW w:w="1353" w:type="dxa"/>
+            <w:tcW w:w="1354" w:type="dxa"/>
             <w:tcBorders>
               <w:start w:val="single" w:sz="4" w:space="0" w:color="000000"/>
               <w:bottom w:val="single" w:sz="4" w:space="0" w:color="000000"/>
@@ -2874,7 +4433,7 @@
         </w:tc>
         <w:tc>
           <w:tcPr>
-            <w:tcW w:w="2931" w:type="dxa"/>
+            <w:tcW w:w="2930" w:type="dxa"/>
             <w:tcBorders>
               <w:start w:val="single" w:sz="4" w:space="0" w:color="000000"/>
               <w:bottom w:val="single" w:sz="4" w:space="0" w:color="000000"/>
@@ -2985,7 +4544,7 @@
         </w:tc>
         <w:tc>
           <w:tcPr>
-            <w:tcW w:w="1353" w:type="dxa"/>
+            <w:tcW w:w="1354" w:type="dxa"/>
             <w:tcBorders>
               <w:start w:val="single" w:sz="4" w:space="0" w:color="000000"/>
               <w:bottom w:val="single" w:sz="4" w:space="0" w:color="000000"/>
@@ -3130,7 +4689,7 @@
         </w:tc>
         <w:tc>
           <w:tcPr>
-            <w:tcW w:w="2931" w:type="dxa"/>
+            <w:tcW w:w="2930" w:type="dxa"/>
             <w:tcBorders>
               <w:start w:val="single" w:sz="4" w:space="0" w:color="000000"/>
               <w:bottom w:val="single" w:sz="4" w:space="0" w:color="000000"/>
@@ -3241,7 +4800,7 @@
         </w:tc>
         <w:tc>
           <w:tcPr>
-            <w:tcW w:w="1353" w:type="dxa"/>
+            <w:tcW w:w="1354" w:type="dxa"/>
             <w:tcBorders>
               <w:start w:val="single" w:sz="4" w:space="0" w:color="000000"/>
               <w:bottom w:val="single" w:sz="4" w:space="0" w:color="000000"/>
@@ -3386,7 +4945,7 @@
         </w:tc>
         <w:tc>
           <w:tcPr>
-            <w:tcW w:w="2931" w:type="dxa"/>
+            <w:tcW w:w="2930" w:type="dxa"/>
             <w:tcBorders>
               <w:start w:val="single" w:sz="4" w:space="0" w:color="000000"/>
               <w:bottom w:val="single" w:sz="4" w:space="0" w:color="000000"/>
@@ -3497,7 +5056,7 @@
         </w:tc>
         <w:tc>
           <w:tcPr>
-            <w:tcW w:w="1353" w:type="dxa"/>
+            <w:tcW w:w="1354" w:type="dxa"/>
             <w:tcBorders>
               <w:start w:val="single" w:sz="4" w:space="0" w:color="000000"/>
               <w:bottom w:val="single" w:sz="4" w:space="0" w:color="000000"/>
@@ -3642,7 +5201,7 @@
         </w:tc>
         <w:tc>
           <w:tcPr>
-            <w:tcW w:w="2931" w:type="dxa"/>
+            <w:tcW w:w="2930" w:type="dxa"/>
             <w:tcBorders>
               <w:start w:val="single" w:sz="4" w:space="0" w:color="000000"/>
               <w:bottom w:val="single" w:sz="4" w:space="0" w:color="000000"/>
@@ -3753,7 +5312,7 @@
         </w:tc>
         <w:tc>
           <w:tcPr>
-            <w:tcW w:w="1353" w:type="dxa"/>
+            <w:tcW w:w="1354" w:type="dxa"/>
             <w:tcBorders>
               <w:start w:val="single" w:sz="4" w:space="0" w:color="000000"/>
               <w:bottom w:val="single" w:sz="4" w:space="0" w:color="000000"/>
@@ -3898,7 +5457,7 @@
         </w:tc>
         <w:tc>
           <w:tcPr>
-            <w:tcW w:w="2931" w:type="dxa"/>
+            <w:tcW w:w="2930" w:type="dxa"/>
             <w:tcBorders>
               <w:start w:val="single" w:sz="4" w:space="0" w:color="000000"/>
               <w:bottom w:val="single" w:sz="4" w:space="0" w:color="000000"/>
@@ -3992,7 +5551,7 @@
         </w:tc>
         <w:tc>
           <w:tcPr>
-            <w:tcW w:w="1353" w:type="dxa"/>
+            <w:tcW w:w="1354" w:type="dxa"/>
             <w:tcBorders>
               <w:start w:val="single" w:sz="4" w:space="0" w:color="000000"/>
               <w:bottom w:val="single" w:sz="4" w:space="0" w:color="000000"/>
@@ -4137,7 +5696,7 @@
         </w:tc>
         <w:tc>
           <w:tcPr>
-            <w:tcW w:w="2931" w:type="dxa"/>
+            <w:tcW w:w="2930" w:type="dxa"/>
             <w:tcBorders>
               <w:start w:val="single" w:sz="4" w:space="0" w:color="000000"/>
               <w:bottom w:val="single" w:sz="4" w:space="0" w:color="000000"/>
@@ -4231,7 +5790,7 @@
         </w:tc>
         <w:tc>
           <w:tcPr>
-            <w:tcW w:w="1353" w:type="dxa"/>
+            <w:tcW w:w="1354" w:type="dxa"/>
             <w:tcBorders>
               <w:start w:val="single" w:sz="4" w:space="0" w:color="000000"/>
               <w:bottom w:val="single" w:sz="4" w:space="0" w:color="000000"/>
@@ -4376,7 +5935,7 @@
         </w:tc>
         <w:tc>
           <w:tcPr>
-            <w:tcW w:w="2931" w:type="dxa"/>
+            <w:tcW w:w="2930" w:type="dxa"/>
             <w:tcBorders>
               <w:start w:val="single" w:sz="4" w:space="0" w:color="000000"/>
               <w:bottom w:val="single" w:sz="4" w:space="0" w:color="000000"/>
@@ -4470,7 +6029,7 @@
         </w:tc>
         <w:tc>
           <w:tcPr>
-            <w:tcW w:w="1353" w:type="dxa"/>
+            <w:tcW w:w="1354" w:type="dxa"/>
             <w:tcBorders>
               <w:start w:val="single" w:sz="4" w:space="0" w:color="000000"/>
               <w:bottom w:val="single" w:sz="4" w:space="0" w:color="000000"/>
@@ -4615,7 +6174,7 @@
         </w:tc>
         <w:tc>
           <w:tcPr>
-            <w:tcW w:w="2931" w:type="dxa"/>
+            <w:tcW w:w="2930" w:type="dxa"/>
             <w:tcBorders>
               <w:start w:val="single" w:sz="4" w:space="0" w:color="000000"/>
               <w:bottom w:val="single" w:sz="4" w:space="0" w:color="000000"/>
@@ -4709,7 +6268,7 @@
         </w:tc>
         <w:tc>
           <w:tcPr>
-            <w:tcW w:w="1353" w:type="dxa"/>
+            <w:tcW w:w="1354" w:type="dxa"/>
             <w:tcBorders>
               <w:start w:val="single" w:sz="4" w:space="0" w:color="000000"/>
               <w:bottom w:val="single" w:sz="4" w:space="0" w:color="000000"/>
@@ -4854,7 +6413,7 @@
         </w:tc>
         <w:tc>
           <w:tcPr>
-            <w:tcW w:w="2931" w:type="dxa"/>
+            <w:tcW w:w="2930" w:type="dxa"/>
             <w:tcBorders>
               <w:start w:val="single" w:sz="4" w:space="0" w:color="000000"/>
               <w:bottom w:val="single" w:sz="4" w:space="0" w:color="000000"/>
@@ -4948,7 +6507,7 @@
         </w:tc>
         <w:tc>
           <w:tcPr>
-            <w:tcW w:w="1353" w:type="dxa"/>
+            <w:tcW w:w="1354" w:type="dxa"/>
             <w:tcBorders>
               <w:start w:val="single" w:sz="4" w:space="0" w:color="000000"/>
               <w:bottom w:val="single" w:sz="4" w:space="0" w:color="000000"/>
@@ -5093,7 +6652,7 @@
         </w:tc>
         <w:tc>
           <w:tcPr>
-            <w:tcW w:w="2931" w:type="dxa"/>
+            <w:tcW w:w="2930" w:type="dxa"/>
             <w:tcBorders>
               <w:start w:val="single" w:sz="4" w:space="0" w:color="000000"/>
               <w:bottom w:val="single" w:sz="4" w:space="0" w:color="000000"/>
@@ -5187,7 +6746,7 @@
         </w:tc>
         <w:tc>
           <w:tcPr>
-            <w:tcW w:w="1353" w:type="dxa"/>
+            <w:tcW w:w="1354" w:type="dxa"/>
             <w:tcBorders>
               <w:start w:val="single" w:sz="4" w:space="0" w:color="000000"/>
               <w:bottom w:val="single" w:sz="4" w:space="0" w:color="000000"/>
@@ -5319,7 +6878,7 @@
         </w:tc>
         <w:tc>
           <w:tcPr>
-            <w:tcW w:w="2931" w:type="dxa"/>
+            <w:tcW w:w="2930" w:type="dxa"/>
             <w:tcBorders>
               <w:start w:val="single" w:sz="4" w:space="0" w:color="000000"/>
               <w:bottom w:val="single" w:sz="4" w:space="0" w:color="000000"/>
@@ -5430,7 +6989,7 @@
         </w:tc>
         <w:tc>
           <w:tcPr>
-            <w:tcW w:w="1353" w:type="dxa"/>
+            <w:tcW w:w="1354" w:type="dxa"/>
             <w:tcBorders>
               <w:start w:val="single" w:sz="4" w:space="0" w:color="000000"/>
               <w:bottom w:val="single" w:sz="4" w:space="0" w:color="000000"/>
@@ -5575,7 +7134,7 @@
         </w:tc>
         <w:tc>
           <w:tcPr>
-            <w:tcW w:w="2931" w:type="dxa"/>
+            <w:tcW w:w="2930" w:type="dxa"/>
             <w:tcBorders>
               <w:start w:val="single" w:sz="4" w:space="0" w:color="000000"/>
               <w:bottom w:val="single" w:sz="4" w:space="0" w:color="000000"/>
@@ -5669,7 +7228,7 @@
         </w:tc>
         <w:tc>
           <w:tcPr>
-            <w:tcW w:w="1353" w:type="dxa"/>
+            <w:tcW w:w="1354" w:type="dxa"/>
             <w:tcBorders>
               <w:start w:val="single" w:sz="4" w:space="0" w:color="000000"/>
               <w:bottom w:val="single" w:sz="4" w:space="0" w:color="000000"/>
@@ -5814,7 +7373,7 @@
         </w:tc>
         <w:tc>
           <w:tcPr>
-            <w:tcW w:w="2931" w:type="dxa"/>
+            <w:tcW w:w="2930" w:type="dxa"/>
             <w:tcBorders>
               <w:start w:val="single" w:sz="4" w:space="0" w:color="000000"/>
               <w:bottom w:val="single" w:sz="4" w:space="0" w:color="000000"/>
@@ -5908,7 +7467,7 @@
         </w:tc>
         <w:tc>
           <w:tcPr>
-            <w:tcW w:w="1353" w:type="dxa"/>
+            <w:tcW w:w="1354" w:type="dxa"/>
             <w:tcBorders>
               <w:start w:val="single" w:sz="4" w:space="0" w:color="000000"/>
               <w:bottom w:val="single" w:sz="4" w:space="0" w:color="000000"/>
@@ -6054,7 +7613,7 @@
         </w:tc>
         <w:tc>
           <w:tcPr>
-            <w:tcW w:w="2931" w:type="dxa"/>
+            <w:tcW w:w="2930" w:type="dxa"/>
             <w:tcBorders>
               <w:start w:val="single" w:sz="4" w:space="0" w:color="000000"/>
               <w:bottom w:val="single" w:sz="4" w:space="0" w:color="000000"/>
@@ -6148,7 +7707,7 @@
         </w:tc>
         <w:tc>
           <w:tcPr>
-            <w:tcW w:w="1353" w:type="dxa"/>
+            <w:tcW w:w="1354" w:type="dxa"/>
             <w:tcBorders>
               <w:start w:val="single" w:sz="4" w:space="0" w:color="000000"/>
               <w:bottom w:val="single" w:sz="4" w:space="0" w:color="000000"/>
@@ -6293,7 +7852,7 @@
         </w:tc>
         <w:tc>
           <w:tcPr>
-            <w:tcW w:w="2931" w:type="dxa"/>
+            <w:tcW w:w="2930" w:type="dxa"/>
             <w:tcBorders>
               <w:start w:val="single" w:sz="4" w:space="0" w:color="000000"/>
               <w:bottom w:val="single" w:sz="4" w:space="0" w:color="000000"/>
@@ -6387,7 +7946,7 @@
         </w:tc>
         <w:tc>
           <w:tcPr>
-            <w:tcW w:w="1353" w:type="dxa"/>
+            <w:tcW w:w="1354" w:type="dxa"/>
             <w:tcBorders>
               <w:start w:val="single" w:sz="4" w:space="0" w:color="000000"/>
               <w:bottom w:val="single" w:sz="4" w:space="0" w:color="000000"/>
@@ -6530,7 +8089,7 @@
         </w:tc>
         <w:tc>
           <w:tcPr>
-            <w:tcW w:w="2931" w:type="dxa"/>
+            <w:tcW w:w="2930" w:type="dxa"/>
             <w:tcBorders>
               <w:start w:val="single" w:sz="4" w:space="0" w:color="000000"/>
               <w:bottom w:val="single" w:sz="4" w:space="0" w:color="000000"/>
@@ -6641,7 +8200,7 @@
         </w:tc>
         <w:tc>
           <w:tcPr>
-            <w:tcW w:w="1353" w:type="dxa"/>
+            <w:tcW w:w="1354" w:type="dxa"/>
             <w:tcBorders>
               <w:start w:val="single" w:sz="4" w:space="0" w:color="000000"/>
               <w:bottom w:val="single" w:sz="4" w:space="0" w:color="000000"/>
@@ -6764,6 +8323,8 @@
         <w:ind w:hanging="0" w:start="0"/>
         <w:rPr/>
       </w:pPr>
+      <w:bookmarkStart w:id="3" w:name="__RefHeading___Toc2098_1783282664"/>
+      <w:bookmarkEnd w:id="3"/>
       <w:r>
         <w:rPr/>
         <w:t>Peak detector – slow</w:t>
@@ -6800,9 +8361,9 @@
       </w:tblPr>
       <w:tblGrid>
         <w:gridCol w:w="1678"/>
-        <w:gridCol w:w="2603"/>
+        <w:gridCol w:w="2602"/>
         <w:gridCol w:w="1800"/>
-        <w:gridCol w:w="1353"/>
+        <w:gridCol w:w="1354"/>
         <w:gridCol w:w="2538"/>
       </w:tblGrid>
       <w:tr>
@@ -6846,7 +8407,7 @@
         </w:tc>
         <w:tc>
           <w:tcPr>
-            <w:tcW w:w="2603" w:type="dxa"/>
+            <w:tcW w:w="2602" w:type="dxa"/>
             <w:tcBorders>
               <w:top w:val="single" w:sz="4" w:space="0" w:color="000000"/>
               <w:start w:val="single" w:sz="4" w:space="0" w:color="000000"/>
@@ -6920,7 +8481,7 @@
         </w:tc>
         <w:tc>
           <w:tcPr>
-            <w:tcW w:w="1353" w:type="dxa"/>
+            <w:tcW w:w="1354" w:type="dxa"/>
             <w:tcBorders>
               <w:top w:val="single" w:sz="4" w:space="0" w:color="000000"/>
               <w:start w:val="single" w:sz="4" w:space="0" w:color="000000"/>
@@ -7045,7 +8606,7 @@
         </w:tc>
         <w:tc>
           <w:tcPr>
-            <w:tcW w:w="2603" w:type="dxa"/>
+            <w:tcW w:w="2602" w:type="dxa"/>
             <w:tcBorders>
               <w:start w:val="single" w:sz="4" w:space="0" w:color="000000"/>
               <w:bottom w:val="single" w:sz="4" w:space="0" w:color="000000"/>
@@ -7207,7 +8768,7 @@
         </w:tc>
         <w:tc>
           <w:tcPr>
-            <w:tcW w:w="1353" w:type="dxa"/>
+            <w:tcW w:w="1354" w:type="dxa"/>
             <w:tcBorders>
               <w:start w:val="single" w:sz="4" w:space="0" w:color="000000"/>
               <w:bottom w:val="single" w:sz="4" w:space="0" w:color="000000"/>
@@ -7352,7 +8913,7 @@
         </w:tc>
         <w:tc>
           <w:tcPr>
-            <w:tcW w:w="2603" w:type="dxa"/>
+            <w:tcW w:w="2602" w:type="dxa"/>
             <w:tcBorders>
               <w:start w:val="single" w:sz="4" w:space="0" w:color="000000"/>
               <w:bottom w:val="single" w:sz="4" w:space="0" w:color="000000"/>
@@ -7456,7 +9017,7 @@
         </w:tc>
         <w:tc>
           <w:tcPr>
-            <w:tcW w:w="1353" w:type="dxa"/>
+            <w:tcW w:w="1354" w:type="dxa"/>
             <w:tcBorders>
               <w:start w:val="single" w:sz="4" w:space="0" w:color="000000"/>
               <w:bottom w:val="single" w:sz="4" w:space="0" w:color="000000"/>
@@ -7601,7 +9162,7 @@
         </w:tc>
         <w:tc>
           <w:tcPr>
-            <w:tcW w:w="2603" w:type="dxa"/>
+            <w:tcW w:w="2602" w:type="dxa"/>
             <w:tcBorders>
               <w:start w:val="single" w:sz="4" w:space="0" w:color="000000"/>
               <w:bottom w:val="single" w:sz="4" w:space="0" w:color="000000"/>
@@ -7689,56 +9250,7 @@
                 <w:b w:val="false"/>
                 <w:bCs w:val="false"/>
               </w:rPr>
-              <w:t>(</w:t>
-            </w:r>
-            <w:r>
-              <w:rPr>
-                <w:b w:val="false"/>
-                <w:bCs w:val="false"/>
-              </w:rPr>
-              <w:t>tau_pk_top</w:t>
-            </w:r>
-            <w:r>
-              <w:rPr>
-                <w:b w:val="false"/>
-                <w:bCs w:val="false"/>
-              </w:rPr>
-              <w:t>_fast</w:t>
-            </w:r>
-            <w:r>
-              <w:rPr>
-                <w:b w:val="false"/>
-                <w:bCs w:val="false"/>
-              </w:rPr>
-              <w:t xml:space="preserve"> + tot_factor*tau_pk</w:t>
-            </w:r>
-            <w:r>
-              <w:rPr>
-                <w:b w:val="false"/>
-                <w:bCs w:val="false"/>
-              </w:rPr>
-              <w:t>_fast</w:t>
-            </w:r>
-            <w:r>
-              <w:rPr>
-                <w:b w:val="false"/>
-                <w:bCs w:val="false"/>
-              </w:rPr>
-              <w:t>)/</w:t>
-            </w:r>
-            <w:r>
-              <w:rPr>
-                <w:b w:val="false"/>
-                <w:bCs w:val="false"/>
-              </w:rPr>
-              <w:t>T</w:t>
-            </w:r>
-            <w:r>
-              <w:rPr>
-                <w:b w:val="false"/>
-                <w:bCs w:val="false"/>
-              </w:rPr>
-              <w:t>clk</w:t>
+              <w:t>(tau_pk_top_fast + tot_factor*tau_pk_fast)/Tclk</w:t>
             </w:r>
           </w:p>
         </w:tc>
@@ -7791,7 +9303,7 @@
         </w:tc>
         <w:tc>
           <w:tcPr>
-            <w:tcW w:w="1353" w:type="dxa"/>
+            <w:tcW w:w="1354" w:type="dxa"/>
             <w:tcBorders>
               <w:start w:val="single" w:sz="4" w:space="0" w:color="000000"/>
               <w:bottom w:val="single" w:sz="4" w:space="0" w:color="000000"/>
@@ -7936,7 +9448,7 @@
         </w:tc>
         <w:tc>
           <w:tcPr>
-            <w:tcW w:w="2603" w:type="dxa"/>
+            <w:tcW w:w="2602" w:type="dxa"/>
             <w:tcBorders>
               <w:start w:val="single" w:sz="4" w:space="0" w:color="000000"/>
               <w:bottom w:val="single" w:sz="4" w:space="0" w:color="000000"/>
@@ -8023,7 +9535,7 @@
         </w:tc>
         <w:tc>
           <w:tcPr>
-            <w:tcW w:w="1353" w:type="dxa"/>
+            <w:tcW w:w="1354" w:type="dxa"/>
             <w:tcBorders>
               <w:start w:val="single" w:sz="4" w:space="0" w:color="000000"/>
               <w:bottom w:val="single" w:sz="4" w:space="0" w:color="000000"/>
@@ -8168,7 +9680,7 @@
         </w:tc>
         <w:tc>
           <w:tcPr>
-            <w:tcW w:w="2603" w:type="dxa"/>
+            <w:tcW w:w="2602" w:type="dxa"/>
             <w:tcBorders>
               <w:start w:val="single" w:sz="4" w:space="0" w:color="000000"/>
               <w:bottom w:val="single" w:sz="4" w:space="0" w:color="000000"/>
@@ -8271,7 +9783,7 @@
         </w:tc>
         <w:tc>
           <w:tcPr>
-            <w:tcW w:w="1353" w:type="dxa"/>
+            <w:tcW w:w="1354" w:type="dxa"/>
             <w:tcBorders>
               <w:start w:val="single" w:sz="4" w:space="0" w:color="000000"/>
               <w:bottom w:val="single" w:sz="4" w:space="0" w:color="000000"/>
@@ -8403,7 +9915,7 @@
         </w:tc>
         <w:tc>
           <w:tcPr>
-            <w:tcW w:w="2603" w:type="dxa"/>
+            <w:tcW w:w="2602" w:type="dxa"/>
             <w:tcBorders>
               <w:start w:val="single" w:sz="4" w:space="0" w:color="000000"/>
               <w:bottom w:val="single" w:sz="4" w:space="0" w:color="000000"/>
@@ -8497,7 +10009,7 @@
         </w:tc>
         <w:tc>
           <w:tcPr>
-            <w:tcW w:w="1353" w:type="dxa"/>
+            <w:tcW w:w="1354" w:type="dxa"/>
             <w:tcBorders>
               <w:start w:val="single" w:sz="4" w:space="0" w:color="000000"/>
               <w:bottom w:val="single" w:sz="4" w:space="0" w:color="000000"/>
@@ -8614,6 +10126,8 @@
         <w:ind w:hanging="0" w:start="0"/>
         <w:rPr/>
       </w:pPr>
+      <w:bookmarkStart w:id="4" w:name="__RefHeading___Toc2100_1783282664"/>
+      <w:bookmarkEnd w:id="4"/>
       <w:r>
         <w:rPr/>
         <w:t>Scope</w:t>
@@ -8649,17 +10163,17 @@
         </w:tblCellMar>
       </w:tblPr>
       <w:tblGrid>
-        <w:gridCol w:w="1855"/>
+        <w:gridCol w:w="1854"/>
         <w:gridCol w:w="2426"/>
         <w:gridCol w:w="1800"/>
-        <w:gridCol w:w="1353"/>
+        <w:gridCol w:w="1354"/>
         <w:gridCol w:w="2538"/>
       </w:tblGrid>
       <w:tr>
         <w:trPr/>
         <w:tc>
           <w:tcPr>
-            <w:tcW w:w="1855" w:type="dxa"/>
+            <w:tcW w:w="1854" w:type="dxa"/>
             <w:tcBorders>
               <w:top w:val="single" w:sz="4" w:space="0" w:color="000000"/>
               <w:start w:val="single" w:sz="4" w:space="0" w:color="000000"/>
@@ -8770,7 +10284,7 @@
         </w:tc>
         <w:tc>
           <w:tcPr>
-            <w:tcW w:w="1353" w:type="dxa"/>
+            <w:tcW w:w="1354" w:type="dxa"/>
             <w:tcBorders>
               <w:top w:val="single" w:sz="4" w:space="0" w:color="000000"/>
               <w:start w:val="single" w:sz="4" w:space="0" w:color="000000"/>
@@ -8848,7 +10362,7 @@
         <w:trPr/>
         <w:tc>
           <w:tcPr>
-            <w:tcW w:w="1855" w:type="dxa"/>
+            <w:tcW w:w="1854" w:type="dxa"/>
             <w:tcBorders>
               <w:start w:val="single" w:sz="4" w:space="0" w:color="000000"/>
               <w:bottom w:val="single" w:sz="4" w:space="0" w:color="000000"/>
@@ -9057,7 +10571,7 @@
         </w:tc>
         <w:tc>
           <w:tcPr>
-            <w:tcW w:w="1353" w:type="dxa"/>
+            <w:tcW w:w="1354" w:type="dxa"/>
             <w:tcBorders>
               <w:start w:val="single" w:sz="4" w:space="0" w:color="000000"/>
               <w:bottom w:val="single" w:sz="4" w:space="0" w:color="000000"/>
@@ -9155,7 +10669,7 @@
         <w:trPr/>
         <w:tc>
           <w:tcPr>
-            <w:tcW w:w="1855" w:type="dxa"/>
+            <w:tcW w:w="1854" w:type="dxa"/>
             <w:tcBorders>
               <w:start w:val="single" w:sz="4" w:space="0" w:color="000000"/>
               <w:bottom w:val="single" w:sz="4" w:space="0" w:color="000000"/>
@@ -9276,7 +10790,7 @@
         </w:tc>
         <w:tc>
           <w:tcPr>
-            <w:tcW w:w="1353" w:type="dxa"/>
+            <w:tcW w:w="1354" w:type="dxa"/>
             <w:tcBorders>
               <w:start w:val="single" w:sz="4" w:space="0" w:color="000000"/>
               <w:bottom w:val="single" w:sz="4" w:space="0" w:color="000000"/>
@@ -9374,7 +10888,7 @@
         <w:trPr/>
         <w:tc>
           <w:tcPr>
-            <w:tcW w:w="1855" w:type="dxa"/>
+            <w:tcW w:w="1854" w:type="dxa"/>
             <w:tcBorders>
               <w:start w:val="single" w:sz="4" w:space="0" w:color="000000"/>
               <w:bottom w:val="single" w:sz="4" w:space="0" w:color="000000"/>
@@ -9508,7 +11022,7 @@
         </w:tc>
         <w:tc>
           <w:tcPr>
-            <w:tcW w:w="1353" w:type="dxa"/>
+            <w:tcW w:w="1354" w:type="dxa"/>
             <w:tcBorders>
               <w:start w:val="single" w:sz="4" w:space="0" w:color="000000"/>
               <w:bottom w:val="single" w:sz="4" w:space="0" w:color="000000"/>
@@ -9606,7 +11120,7 @@
         <w:trPr/>
         <w:tc>
           <w:tcPr>
-            <w:tcW w:w="1855" w:type="dxa"/>
+            <w:tcW w:w="1854" w:type="dxa"/>
             <w:tcBorders>
               <w:start w:val="single" w:sz="4" w:space="0" w:color="000000"/>
               <w:bottom w:val="single" w:sz="4" w:space="0" w:color="000000"/>
@@ -9740,7 +11254,7 @@
         </w:tc>
         <w:tc>
           <w:tcPr>
-            <w:tcW w:w="1353" w:type="dxa"/>
+            <w:tcW w:w="1354" w:type="dxa"/>
             <w:tcBorders>
               <w:start w:val="single" w:sz="4" w:space="0" w:color="000000"/>
               <w:bottom w:val="single" w:sz="4" w:space="0" w:color="000000"/>
@@ -9838,7 +11352,7 @@
         <w:trPr/>
         <w:tc>
           <w:tcPr>
-            <w:tcW w:w="1855" w:type="dxa"/>
+            <w:tcW w:w="1854" w:type="dxa"/>
             <w:tcBorders>
               <w:start w:val="single" w:sz="4" w:space="0" w:color="000000"/>
               <w:bottom w:val="single" w:sz="4" w:space="0" w:color="000000"/>
@@ -9966,7 +11480,7 @@
         </w:tc>
         <w:tc>
           <w:tcPr>
-            <w:tcW w:w="1353" w:type="dxa"/>
+            <w:tcW w:w="1354" w:type="dxa"/>
             <w:tcBorders>
               <w:start w:val="single" w:sz="4" w:space="0" w:color="000000"/>
               <w:bottom w:val="single" w:sz="4" w:space="0" w:color="000000"/>
@@ -10051,7 +11565,7 @@
         <w:trPr/>
         <w:tc>
           <w:tcPr>
-            <w:tcW w:w="1855" w:type="dxa"/>
+            <w:tcW w:w="1854" w:type="dxa"/>
             <w:tcBorders>
               <w:start w:val="single" w:sz="4" w:space="0" w:color="000000"/>
               <w:bottom w:val="single" w:sz="4" w:space="0" w:color="000000"/>
@@ -10192,7 +11706,7 @@
         </w:tc>
         <w:tc>
           <w:tcPr>
-            <w:tcW w:w="1353" w:type="dxa"/>
+            <w:tcW w:w="1354" w:type="dxa"/>
             <w:tcBorders>
               <w:start w:val="single" w:sz="4" w:space="0" w:color="000000"/>
               <w:bottom w:val="single" w:sz="4" w:space="0" w:color="000000"/>
@@ -10290,7 +11804,7 @@
         <w:trPr/>
         <w:tc>
           <w:tcPr>
-            <w:tcW w:w="1855" w:type="dxa"/>
+            <w:tcW w:w="1854" w:type="dxa"/>
             <w:tcBorders>
               <w:start w:val="single" w:sz="4" w:space="0" w:color="000000"/>
               <w:bottom w:val="single" w:sz="4" w:space="0" w:color="000000"/>
@@ -10431,7 +11945,7 @@
         </w:tc>
         <w:tc>
           <w:tcPr>
-            <w:tcW w:w="1353" w:type="dxa"/>
+            <w:tcW w:w="1354" w:type="dxa"/>
             <w:tcBorders>
               <w:start w:val="single" w:sz="4" w:space="0" w:color="000000"/>
               <w:bottom w:val="single" w:sz="4" w:space="0" w:color="000000"/>
@@ -10529,7 +12043,7 @@
         <w:trPr/>
         <w:tc>
           <w:tcPr>
-            <w:tcW w:w="1855" w:type="dxa"/>
+            <w:tcW w:w="1854" w:type="dxa"/>
             <w:tcBorders>
               <w:start w:val="single" w:sz="4" w:space="0" w:color="000000"/>
               <w:bottom w:val="single" w:sz="4" w:space="0" w:color="000000"/>
@@ -10670,7 +12184,7 @@
         </w:tc>
         <w:tc>
           <w:tcPr>
-            <w:tcW w:w="1353" w:type="dxa"/>
+            <w:tcW w:w="1354" w:type="dxa"/>
             <w:tcBorders>
               <w:start w:val="single" w:sz="4" w:space="0" w:color="000000"/>
               <w:bottom w:val="single" w:sz="4" w:space="0" w:color="000000"/>
@@ -10768,7 +12282,7 @@
         <w:trPr/>
         <w:tc>
           <w:tcPr>
-            <w:tcW w:w="1855" w:type="dxa"/>
+            <w:tcW w:w="1854" w:type="dxa"/>
             <w:tcBorders>
               <w:start w:val="single" w:sz="4" w:space="0" w:color="000000"/>
               <w:bottom w:val="single" w:sz="4" w:space="0" w:color="000000"/>
@@ -11100,7 +12614,7 @@
         </w:tc>
         <w:tc>
           <w:tcPr>
-            <w:tcW w:w="1353" w:type="dxa"/>
+            <w:tcW w:w="1354" w:type="dxa"/>
             <w:tcBorders>
               <w:start w:val="single" w:sz="4" w:space="0" w:color="000000"/>
               <w:bottom w:val="single" w:sz="4" w:space="0" w:color="000000"/>
@@ -11349,7 +12863,7 @@
         <w:trPr/>
         <w:tc>
           <w:tcPr>
-            <w:tcW w:w="1855" w:type="dxa"/>
+            <w:tcW w:w="1854" w:type="dxa"/>
             <w:tcBorders>
               <w:start w:val="single" w:sz="4" w:space="0" w:color="000000"/>
               <w:bottom w:val="single" w:sz="4" w:space="0" w:color="000000"/>
@@ -11490,7 +13004,7 @@
         </w:tc>
         <w:tc>
           <w:tcPr>
-            <w:tcW w:w="1353" w:type="dxa"/>
+            <w:tcW w:w="1354" w:type="dxa"/>
             <w:tcBorders>
               <w:start w:val="single" w:sz="4" w:space="0" w:color="000000"/>
               <w:bottom w:val="single" w:sz="4" w:space="0" w:color="000000"/>
@@ -11601,6 +13115,8 @@
         <w:ind w:hanging="0" w:start="0"/>
         <w:rPr/>
       </w:pPr>
+      <w:bookmarkStart w:id="5" w:name="__RefHeading___Toc2102_1783282664"/>
+      <w:bookmarkEnd w:id="5"/>
       <w:r>
         <w:rPr/>
         <w:t>Timers</w:t>
@@ -11637,9 +13153,9 @@
       </w:tblPr>
       <w:tblGrid>
         <w:gridCol w:w="1678"/>
-        <w:gridCol w:w="2971"/>
+        <w:gridCol w:w="2970"/>
         <w:gridCol w:w="1884"/>
-        <w:gridCol w:w="1530"/>
+        <w:gridCol w:w="1531"/>
         <w:gridCol w:w="1909"/>
       </w:tblGrid>
       <w:tr>
@@ -11683,7 +13199,7 @@
         </w:tc>
         <w:tc>
           <w:tcPr>
-            <w:tcW w:w="2971" w:type="dxa"/>
+            <w:tcW w:w="2970" w:type="dxa"/>
             <w:tcBorders>
               <w:top w:val="single" w:sz="4" w:space="0" w:color="000000"/>
               <w:start w:val="single" w:sz="4" w:space="0" w:color="000000"/>
@@ -11757,7 +13273,7 @@
         </w:tc>
         <w:tc>
           <w:tcPr>
-            <w:tcW w:w="1530" w:type="dxa"/>
+            <w:tcW w:w="1531" w:type="dxa"/>
             <w:tcBorders>
               <w:top w:val="single" w:sz="4" w:space="0" w:color="000000"/>
               <w:start w:val="single" w:sz="4" w:space="0" w:color="000000"/>
@@ -11882,7 +13398,7 @@
         </w:tc>
         <w:tc>
           <w:tcPr>
-            <w:tcW w:w="2971" w:type="dxa"/>
+            <w:tcW w:w="2970" w:type="dxa"/>
             <w:tcBorders>
               <w:start w:val="single" w:sz="4" w:space="0" w:color="000000"/>
               <w:bottom w:val="single" w:sz="4" w:space="0" w:color="000000"/>
@@ -11961,7 +13477,7 @@
         </w:tc>
         <w:tc>
           <w:tcPr>
-            <w:tcW w:w="1530" w:type="dxa"/>
+            <w:tcW w:w="1531" w:type="dxa"/>
             <w:tcBorders>
               <w:start w:val="single" w:sz="4" w:space="0" w:color="000000"/>
               <w:bottom w:val="single" w:sz="4" w:space="0" w:color="000000"/>
@@ -12134,7 +13650,7 @@
         </w:tc>
         <w:tc>
           <w:tcPr>
-            <w:tcW w:w="2971" w:type="dxa"/>
+            <w:tcW w:w="2970" w:type="dxa"/>
             <w:tcBorders>
               <w:start w:val="single" w:sz="4" w:space="0" w:color="000000"/>
               <w:bottom w:val="single" w:sz="4" w:space="0" w:color="000000"/>
@@ -12634,7 +14150,7 @@
         </w:tc>
         <w:tc>
           <w:tcPr>
-            <w:tcW w:w="1530" w:type="dxa"/>
+            <w:tcW w:w="1531" w:type="dxa"/>
             <w:tcBorders>
               <w:start w:val="single" w:sz="4" w:space="0" w:color="000000"/>
               <w:bottom w:val="single" w:sz="4" w:space="0" w:color="000000"/>
@@ -12820,6 +14336,8 @@
         <w:ind w:hanging="0" w:start="0"/>
         <w:rPr/>
       </w:pPr>
+      <w:bookmarkStart w:id="6" w:name="__RefHeading___Toc2104_1783282664"/>
+      <w:bookmarkEnd w:id="6"/>
       <w:r>
         <w:rPr/>
         <w:t>Baseline restorer - slow</w:t>
@@ -12855,17 +14373,17 @@
         </w:tblCellMar>
       </w:tblPr>
       <w:tblGrid>
-        <w:gridCol w:w="1133"/>
+        <w:gridCol w:w="1132"/>
         <w:gridCol w:w="3600"/>
         <w:gridCol w:w="1444"/>
-        <w:gridCol w:w="1173"/>
+        <w:gridCol w:w="1174"/>
         <w:gridCol w:w="2622"/>
       </w:tblGrid>
       <w:tr>
         <w:trPr/>
         <w:tc>
           <w:tcPr>
-            <w:tcW w:w="1133" w:type="dxa"/>
+            <w:tcW w:w="1132" w:type="dxa"/>
             <w:tcBorders>
               <w:top w:val="single" w:sz="4" w:space="0" w:color="000000"/>
               <w:start w:val="single" w:sz="4" w:space="0" w:color="000000"/>
@@ -12976,7 +14494,7 @@
         </w:tc>
         <w:tc>
           <w:tcPr>
-            <w:tcW w:w="1173" w:type="dxa"/>
+            <w:tcW w:w="1174" w:type="dxa"/>
             <w:tcBorders>
               <w:top w:val="single" w:sz="4" w:space="0" w:color="000000"/>
               <w:start w:val="single" w:sz="4" w:space="0" w:color="000000"/>
@@ -13056,7 +14574,7 @@
         </w:trPr>
         <w:tc>
           <w:tcPr>
-            <w:tcW w:w="1133" w:type="dxa"/>
+            <w:tcW w:w="1132" w:type="dxa"/>
             <w:tcBorders>
               <w:start w:val="single" w:sz="4" w:space="0" w:color="000000"/>
               <w:bottom w:val="single" w:sz="4" w:space="0" w:color="000000"/>
@@ -13209,7 +14727,7 @@
         </w:tc>
         <w:tc>
           <w:tcPr>
-            <w:tcW w:w="1173" w:type="dxa"/>
+            <w:tcW w:w="1174" w:type="dxa"/>
             <w:tcBorders>
               <w:start w:val="single" w:sz="4" w:space="0" w:color="000000"/>
               <w:bottom w:val="single" w:sz="4" w:space="0" w:color="000000"/>
@@ -13347,7 +14865,7 @@
         <w:trPr/>
         <w:tc>
           <w:tcPr>
-            <w:tcW w:w="1133" w:type="dxa"/>
+            <w:tcW w:w="1132" w:type="dxa"/>
             <w:tcBorders>
               <w:start w:val="single" w:sz="4" w:space="0" w:color="000000"/>
               <w:bottom w:val="single" w:sz="4" w:space="0" w:color="000000"/>
@@ -14032,7 +15550,7 @@
         </w:tc>
         <w:tc>
           <w:tcPr>
-            <w:tcW w:w="1173" w:type="dxa"/>
+            <w:tcW w:w="1174" w:type="dxa"/>
             <w:tcBorders>
               <w:start w:val="single" w:sz="4" w:space="0" w:color="000000"/>
               <w:bottom w:val="single" w:sz="4" w:space="0" w:color="000000"/>
@@ -14206,7 +15724,7 @@
         <w:trPr/>
         <w:tc>
           <w:tcPr>
-            <w:tcW w:w="1133" w:type="dxa"/>
+            <w:tcW w:w="1132" w:type="dxa"/>
             <w:tcBorders>
               <w:start w:val="single" w:sz="4" w:space="0" w:color="000000"/>
               <w:bottom w:val="single" w:sz="4" w:space="0" w:color="000000"/>
@@ -14346,7 +15864,7 @@
         </w:tc>
         <w:tc>
           <w:tcPr>
-            <w:tcW w:w="1173" w:type="dxa"/>
+            <w:tcW w:w="1174" w:type="dxa"/>
             <w:tcBorders>
               <w:start w:val="single" w:sz="4" w:space="0" w:color="000000"/>
               <w:bottom w:val="single" w:sz="4" w:space="0" w:color="000000"/>
@@ -14444,7 +15962,7 @@
         <w:trPr/>
         <w:tc>
           <w:tcPr>
-            <w:tcW w:w="1133" w:type="dxa"/>
+            <w:tcW w:w="1132" w:type="dxa"/>
             <w:tcBorders>
               <w:start w:val="single" w:sz="4" w:space="0" w:color="000000"/>
               <w:bottom w:val="single" w:sz="4" w:space="0" w:color="000000"/>
@@ -14878,7 +16396,7 @@
         </w:tc>
         <w:tc>
           <w:tcPr>
-            <w:tcW w:w="1173" w:type="dxa"/>
+            <w:tcW w:w="1174" w:type="dxa"/>
             <w:tcBorders>
               <w:start w:val="single" w:sz="4" w:space="0" w:color="000000"/>
               <w:bottom w:val="single" w:sz="4" w:space="0" w:color="000000"/>
@@ -15052,7 +16570,7 @@
         <w:trPr/>
         <w:tc>
           <w:tcPr>
-            <w:tcW w:w="1133" w:type="dxa"/>
+            <w:tcW w:w="1132" w:type="dxa"/>
             <w:tcBorders>
               <w:start w:val="single" w:sz="4" w:space="0" w:color="000000"/>
               <w:bottom w:val="single" w:sz="4" w:space="0" w:color="000000"/>
@@ -15226,7 +16744,7 @@
         </w:tc>
         <w:tc>
           <w:tcPr>
-            <w:tcW w:w="1173" w:type="dxa"/>
+            <w:tcW w:w="1174" w:type="dxa"/>
             <w:tcBorders>
               <w:start w:val="single" w:sz="4" w:space="0" w:color="000000"/>
               <w:bottom w:val="single" w:sz="4" w:space="0" w:color="000000"/>
@@ -15324,7 +16842,7 @@
         <w:trPr/>
         <w:tc>
           <w:tcPr>
-            <w:tcW w:w="1133" w:type="dxa"/>
+            <w:tcW w:w="1132" w:type="dxa"/>
             <w:tcBorders>
               <w:start w:val="single" w:sz="4" w:space="0" w:color="000000"/>
               <w:bottom w:val="single" w:sz="4" w:space="0" w:color="000000"/>
@@ -15498,7 +17016,7 @@
         </w:tc>
         <w:tc>
           <w:tcPr>
-            <w:tcW w:w="1173" w:type="dxa"/>
+            <w:tcW w:w="1174" w:type="dxa"/>
             <w:tcBorders>
               <w:start w:val="single" w:sz="4" w:space="0" w:color="000000"/>
               <w:bottom w:val="single" w:sz="4" w:space="0" w:color="000000"/>
@@ -15596,7 +17114,7 @@
         <w:trPr/>
         <w:tc>
           <w:tcPr>
-            <w:tcW w:w="1133" w:type="dxa"/>
+            <w:tcW w:w="1132" w:type="dxa"/>
             <w:tcBorders>
               <w:start w:val="single" w:sz="4" w:space="0" w:color="000000"/>
               <w:bottom w:val="single" w:sz="4" w:space="0" w:color="000000"/>
@@ -15736,7 +17254,7 @@
         </w:tc>
         <w:tc>
           <w:tcPr>
-            <w:tcW w:w="1173" w:type="dxa"/>
+            <w:tcW w:w="1174" w:type="dxa"/>
             <w:tcBorders>
               <w:start w:val="single" w:sz="4" w:space="0" w:color="000000"/>
               <w:bottom w:val="single" w:sz="4" w:space="0" w:color="000000"/>
@@ -15847,6 +17365,8 @@
         <w:ind w:hanging="0" w:start="0"/>
         <w:rPr/>
       </w:pPr>
+      <w:bookmarkStart w:id="7" w:name="__RefHeading___Toc2106_1783282664"/>
+      <w:bookmarkEnd w:id="7"/>
       <w:r>
         <w:rPr/>
         <w:t>Scope mux</w:t>
@@ -15883,8 +17403,8 @@
       </w:tblPr>
       <w:tblGrid>
         <w:gridCol w:w="1313"/>
-        <w:gridCol w:w="3336"/>
-        <w:gridCol w:w="1351"/>
+        <w:gridCol w:w="3335"/>
+        <w:gridCol w:w="1352"/>
         <w:gridCol w:w="1350"/>
         <w:gridCol w:w="2622"/>
       </w:tblGrid>
@@ -15929,7 +17449,7 @@
         </w:tc>
         <w:tc>
           <w:tcPr>
-            <w:tcW w:w="3336" w:type="dxa"/>
+            <w:tcW w:w="3335" w:type="dxa"/>
             <w:tcBorders>
               <w:top w:val="single" w:sz="4" w:space="0" w:color="000000"/>
               <w:start w:val="single" w:sz="4" w:space="0" w:color="000000"/>
@@ -15966,7 +17486,7 @@
         </w:tc>
         <w:tc>
           <w:tcPr>
-            <w:tcW w:w="1351" w:type="dxa"/>
+            <w:tcW w:w="1352" w:type="dxa"/>
             <w:tcBorders>
               <w:top w:val="single" w:sz="4" w:space="0" w:color="000000"/>
               <w:start w:val="single" w:sz="4" w:space="0" w:color="000000"/>
@@ -16128,7 +17648,7 @@
         </w:tc>
         <w:tc>
           <w:tcPr>
-            <w:tcW w:w="3336" w:type="dxa"/>
+            <w:tcW w:w="3335" w:type="dxa"/>
             <w:tcBorders>
               <w:start w:val="single" w:sz="4" w:space="0" w:color="000000"/>
               <w:bottom w:val="single" w:sz="4" w:space="0" w:color="000000"/>
@@ -16399,7 +17919,7 @@
         </w:tc>
         <w:tc>
           <w:tcPr>
-            <w:tcW w:w="1351" w:type="dxa"/>
+            <w:tcW w:w="1352" w:type="dxa"/>
             <w:tcBorders>
               <w:start w:val="single" w:sz="4" w:space="0" w:color="000000"/>
               <w:bottom w:val="single" w:sz="4" w:space="0" w:color="000000"/>
@@ -16587,6 +18107,8 @@
         <w:ind w:hanging="0" w:start="0"/>
         <w:rPr/>
       </w:pPr>
+      <w:bookmarkStart w:id="8" w:name="__RefHeading___Toc2108_1783282664"/>
+      <w:bookmarkEnd w:id="8"/>
       <w:r>
         <w:rPr/>
         <w:t>DCS slow (deprecated)</w:t>
@@ -16622,17 +18144,17 @@
         </w:tblCellMar>
       </w:tblPr>
       <w:tblGrid>
-        <w:gridCol w:w="2155"/>
+        <w:gridCol w:w="2154"/>
         <w:gridCol w:w="1800"/>
         <w:gridCol w:w="1894"/>
-        <w:gridCol w:w="1895"/>
+        <w:gridCol w:w="1896"/>
         <w:gridCol w:w="2228"/>
       </w:tblGrid>
       <w:tr>
         <w:trPr/>
         <w:tc>
           <w:tcPr>
-            <w:tcW w:w="2155" w:type="dxa"/>
+            <w:tcW w:w="2154" w:type="dxa"/>
             <w:tcBorders>
               <w:top w:val="single" w:sz="4" w:space="0" w:color="000000"/>
               <w:start w:val="single" w:sz="4" w:space="0" w:color="000000"/>
@@ -16743,7 +18265,7 @@
         </w:tc>
         <w:tc>
           <w:tcPr>
-            <w:tcW w:w="1895" w:type="dxa"/>
+            <w:tcW w:w="1896" w:type="dxa"/>
             <w:tcBorders>
               <w:top w:val="single" w:sz="4" w:space="0" w:color="000000"/>
               <w:start w:val="single" w:sz="4" w:space="0" w:color="000000"/>
@@ -16821,7 +18343,7 @@
         <w:trPr/>
         <w:tc>
           <w:tcPr>
-            <w:tcW w:w="2155" w:type="dxa"/>
+            <w:tcW w:w="2154" w:type="dxa"/>
             <w:tcBorders>
               <w:start w:val="single" w:sz="4" w:space="0" w:color="000000"/>
               <w:bottom w:val="single" w:sz="4" w:space="0" w:color="000000"/>
@@ -16927,7 +18449,7 @@
         </w:tc>
         <w:tc>
           <w:tcPr>
-            <w:tcW w:w="1895" w:type="dxa"/>
+            <w:tcW w:w="1896" w:type="dxa"/>
             <w:tcBorders>
               <w:start w:val="single" w:sz="4" w:space="0" w:color="000000"/>
               <w:bottom w:val="single" w:sz="4" w:space="0" w:color="000000"/>
@@ -17003,7 +18525,7 @@
         <w:trPr/>
         <w:tc>
           <w:tcPr>
-            <w:tcW w:w="2155" w:type="dxa"/>
+            <w:tcW w:w="2154" w:type="dxa"/>
             <w:tcBorders>
               <w:start w:val="single" w:sz="4" w:space="0" w:color="000000"/>
               <w:bottom w:val="single" w:sz="4" w:space="0" w:color="000000"/>
@@ -17110,7 +18632,7 @@
         </w:tc>
         <w:tc>
           <w:tcPr>
-            <w:tcW w:w="1895" w:type="dxa"/>
+            <w:tcW w:w="1896" w:type="dxa"/>
             <w:tcBorders>
               <w:start w:val="single" w:sz="4" w:space="0" w:color="000000"/>
               <w:bottom w:val="single" w:sz="4" w:space="0" w:color="000000"/>
@@ -17186,7 +18708,7 @@
         <w:trPr/>
         <w:tc>
           <w:tcPr>
-            <w:tcW w:w="2155" w:type="dxa"/>
+            <w:tcW w:w="2154" w:type="dxa"/>
             <w:tcBorders>
               <w:start w:val="single" w:sz="4" w:space="0" w:color="000000"/>
               <w:bottom w:val="single" w:sz="4" w:space="0" w:color="000000"/>
@@ -17293,7 +18815,7 @@
         </w:tc>
         <w:tc>
           <w:tcPr>
-            <w:tcW w:w="1895" w:type="dxa"/>
+            <w:tcW w:w="1896" w:type="dxa"/>
             <w:tcBorders>
               <w:start w:val="single" w:sz="4" w:space="0" w:color="000000"/>
               <w:bottom w:val="single" w:sz="4" w:space="0" w:color="000000"/>
@@ -17391,6 +18913,8 @@
         <w:ind w:hanging="0" w:start="0"/>
         <w:rPr/>
       </w:pPr>
+      <w:bookmarkStart w:id="9" w:name="__RefHeading___Toc2110_1783282664"/>
+      <w:bookmarkEnd w:id="9"/>
       <w:r>
         <w:rPr/>
         <w:t>Formatter (preprocessing)</w:t>
@@ -18638,6 +20162,8 @@
         <w:ind w:hanging="0" w:start="0"/>
         <w:rPr/>
       </w:pPr>
+      <w:bookmarkStart w:id="10" w:name="__RefHeading___Toc2112_1783282664"/>
+      <w:bookmarkEnd w:id="10"/>
       <w:r>
         <w:rPr/>
         <w:t>Pulse shaper – fast</w:t>
@@ -18674,9 +20200,9 @@
       </w:tblPr>
       <w:tblGrid>
         <w:gridCol w:w="1350"/>
-        <w:gridCol w:w="2931"/>
+        <w:gridCol w:w="2930"/>
         <w:gridCol w:w="1800"/>
-        <w:gridCol w:w="1353"/>
+        <w:gridCol w:w="1354"/>
         <w:gridCol w:w="2538"/>
       </w:tblGrid>
       <w:tr>
@@ -18720,7 +20246,7 @@
         </w:tc>
         <w:tc>
           <w:tcPr>
-            <w:tcW w:w="2931" w:type="dxa"/>
+            <w:tcW w:w="2930" w:type="dxa"/>
             <w:tcBorders>
               <w:top w:val="single" w:sz="4" w:space="0" w:color="000000"/>
               <w:start w:val="single" w:sz="4" w:space="0" w:color="000000"/>
@@ -18794,7 +20320,7 @@
         </w:tc>
         <w:tc>
           <w:tcPr>
-            <w:tcW w:w="1353" w:type="dxa"/>
+            <w:tcW w:w="1354" w:type="dxa"/>
             <w:tcBorders>
               <w:top w:val="single" w:sz="4" w:space="0" w:color="000000"/>
               <w:start w:val="single" w:sz="4" w:space="0" w:color="000000"/>
@@ -18919,7 +20445,7 @@
         </w:tc>
         <w:tc>
           <w:tcPr>
-            <w:tcW w:w="2931" w:type="dxa"/>
+            <w:tcW w:w="2930" w:type="dxa"/>
             <w:tcBorders>
               <w:start w:val="single" w:sz="4" w:space="0" w:color="000000"/>
               <w:bottom w:val="single" w:sz="4" w:space="0" w:color="000000"/>
@@ -19047,7 +20573,7 @@
         </w:tc>
         <w:tc>
           <w:tcPr>
-            <w:tcW w:w="1353" w:type="dxa"/>
+            <w:tcW w:w="1354" w:type="dxa"/>
             <w:tcBorders>
               <w:start w:val="single" w:sz="4" w:space="0" w:color="000000"/>
               <w:bottom w:val="single" w:sz="4" w:space="0" w:color="000000"/>
@@ -19192,7 +20718,7 @@
         </w:tc>
         <w:tc>
           <w:tcPr>
-            <w:tcW w:w="2931" w:type="dxa"/>
+            <w:tcW w:w="2930" w:type="dxa"/>
             <w:tcBorders>
               <w:start w:val="single" w:sz="4" w:space="0" w:color="000000"/>
               <w:bottom w:val="single" w:sz="4" w:space="0" w:color="000000"/>
@@ -19303,7 +20829,7 @@
         </w:tc>
         <w:tc>
           <w:tcPr>
-            <w:tcW w:w="1353" w:type="dxa"/>
+            <w:tcW w:w="1354" w:type="dxa"/>
             <w:tcBorders>
               <w:start w:val="single" w:sz="4" w:space="0" w:color="000000"/>
               <w:bottom w:val="single" w:sz="4" w:space="0" w:color="000000"/>
@@ -19448,7 +20974,7 @@
         </w:tc>
         <w:tc>
           <w:tcPr>
-            <w:tcW w:w="2931" w:type="dxa"/>
+            <w:tcW w:w="2930" w:type="dxa"/>
             <w:tcBorders>
               <w:start w:val="single" w:sz="4" w:space="0" w:color="000000"/>
               <w:bottom w:val="single" w:sz="4" w:space="0" w:color="000000"/>
@@ -19559,7 +21085,7 @@
         </w:tc>
         <w:tc>
           <w:tcPr>
-            <w:tcW w:w="1353" w:type="dxa"/>
+            <w:tcW w:w="1354" w:type="dxa"/>
             <w:tcBorders>
               <w:start w:val="single" w:sz="4" w:space="0" w:color="000000"/>
               <w:bottom w:val="single" w:sz="4" w:space="0" w:color="000000"/>
@@ -19704,7 +21230,7 @@
         </w:tc>
         <w:tc>
           <w:tcPr>
-            <w:tcW w:w="2931" w:type="dxa"/>
+            <w:tcW w:w="2930" w:type="dxa"/>
             <w:tcBorders>
               <w:start w:val="single" w:sz="4" w:space="0" w:color="000000"/>
               <w:bottom w:val="single" w:sz="4" w:space="0" w:color="000000"/>
@@ -19815,7 +21341,7 @@
         </w:tc>
         <w:tc>
           <w:tcPr>
-            <w:tcW w:w="1353" w:type="dxa"/>
+            <w:tcW w:w="1354" w:type="dxa"/>
             <w:tcBorders>
               <w:start w:val="single" w:sz="4" w:space="0" w:color="000000"/>
               <w:bottom w:val="single" w:sz="4" w:space="0" w:color="000000"/>
@@ -19960,7 +21486,7 @@
         </w:tc>
         <w:tc>
           <w:tcPr>
-            <w:tcW w:w="2931" w:type="dxa"/>
+            <w:tcW w:w="2930" w:type="dxa"/>
             <w:tcBorders>
               <w:start w:val="single" w:sz="4" w:space="0" w:color="000000"/>
               <w:bottom w:val="single" w:sz="4" w:space="0" w:color="000000"/>
@@ -20071,7 +21597,7 @@
         </w:tc>
         <w:tc>
           <w:tcPr>
-            <w:tcW w:w="1353" w:type="dxa"/>
+            <w:tcW w:w="1354" w:type="dxa"/>
             <w:tcBorders>
               <w:start w:val="single" w:sz="4" w:space="0" w:color="000000"/>
               <w:bottom w:val="single" w:sz="4" w:space="0" w:color="000000"/>
@@ -20216,7 +21742,7 @@
         </w:tc>
         <w:tc>
           <w:tcPr>
-            <w:tcW w:w="2931" w:type="dxa"/>
+            <w:tcW w:w="2930" w:type="dxa"/>
             <w:tcBorders>
               <w:start w:val="single" w:sz="4" w:space="0" w:color="000000"/>
               <w:bottom w:val="single" w:sz="4" w:space="0" w:color="000000"/>
@@ -20310,7 +21836,7 @@
         </w:tc>
         <w:tc>
           <w:tcPr>
-            <w:tcW w:w="1353" w:type="dxa"/>
+            <w:tcW w:w="1354" w:type="dxa"/>
             <w:tcBorders>
               <w:start w:val="single" w:sz="4" w:space="0" w:color="000000"/>
               <w:bottom w:val="single" w:sz="4" w:space="0" w:color="000000"/>
@@ -20455,7 +21981,7 @@
         </w:tc>
         <w:tc>
           <w:tcPr>
-            <w:tcW w:w="2931" w:type="dxa"/>
+            <w:tcW w:w="2930" w:type="dxa"/>
             <w:tcBorders>
               <w:start w:val="single" w:sz="4" w:space="0" w:color="000000"/>
               <w:bottom w:val="single" w:sz="4" w:space="0" w:color="000000"/>
@@ -20549,7 +22075,7 @@
         </w:tc>
         <w:tc>
           <w:tcPr>
-            <w:tcW w:w="1353" w:type="dxa"/>
+            <w:tcW w:w="1354" w:type="dxa"/>
             <w:tcBorders>
               <w:start w:val="single" w:sz="4" w:space="0" w:color="000000"/>
               <w:bottom w:val="single" w:sz="4" w:space="0" w:color="000000"/>
@@ -20694,7 +22220,7 @@
         </w:tc>
         <w:tc>
           <w:tcPr>
-            <w:tcW w:w="2931" w:type="dxa"/>
+            <w:tcW w:w="2930" w:type="dxa"/>
             <w:tcBorders>
               <w:start w:val="single" w:sz="4" w:space="0" w:color="000000"/>
               <w:bottom w:val="single" w:sz="4" w:space="0" w:color="000000"/>
@@ -20788,7 +22314,7 @@
         </w:tc>
         <w:tc>
           <w:tcPr>
-            <w:tcW w:w="1353" w:type="dxa"/>
+            <w:tcW w:w="1354" w:type="dxa"/>
             <w:tcBorders>
               <w:start w:val="single" w:sz="4" w:space="0" w:color="000000"/>
               <w:bottom w:val="single" w:sz="4" w:space="0" w:color="000000"/>
@@ -20933,7 +22459,7 @@
         </w:tc>
         <w:tc>
           <w:tcPr>
-            <w:tcW w:w="2931" w:type="dxa"/>
+            <w:tcW w:w="2930" w:type="dxa"/>
             <w:tcBorders>
               <w:start w:val="single" w:sz="4" w:space="0" w:color="000000"/>
               <w:bottom w:val="single" w:sz="4" w:space="0" w:color="000000"/>
@@ -21027,7 +22553,7 @@
         </w:tc>
         <w:tc>
           <w:tcPr>
-            <w:tcW w:w="1353" w:type="dxa"/>
+            <w:tcW w:w="1354" w:type="dxa"/>
             <w:tcBorders>
               <w:start w:val="single" w:sz="4" w:space="0" w:color="000000"/>
               <w:bottom w:val="single" w:sz="4" w:space="0" w:color="000000"/>
@@ -21172,7 +22698,7 @@
         </w:tc>
         <w:tc>
           <w:tcPr>
-            <w:tcW w:w="2931" w:type="dxa"/>
+            <w:tcW w:w="2930" w:type="dxa"/>
             <w:tcBorders>
               <w:start w:val="single" w:sz="4" w:space="0" w:color="000000"/>
               <w:bottom w:val="single" w:sz="4" w:space="0" w:color="000000"/>
@@ -21266,7 +22792,7 @@
         </w:tc>
         <w:tc>
           <w:tcPr>
-            <w:tcW w:w="1353" w:type="dxa"/>
+            <w:tcW w:w="1354" w:type="dxa"/>
             <w:tcBorders>
               <w:start w:val="single" w:sz="4" w:space="0" w:color="000000"/>
               <w:bottom w:val="single" w:sz="4" w:space="0" w:color="000000"/>
@@ -21411,7 +22937,7 @@
         </w:tc>
         <w:tc>
           <w:tcPr>
-            <w:tcW w:w="2931" w:type="dxa"/>
+            <w:tcW w:w="2930" w:type="dxa"/>
             <w:tcBorders>
               <w:start w:val="single" w:sz="4" w:space="0" w:color="000000"/>
               <w:bottom w:val="single" w:sz="4" w:space="0" w:color="000000"/>
@@ -21505,7 +23031,7 @@
         </w:tc>
         <w:tc>
           <w:tcPr>
-            <w:tcW w:w="1353" w:type="dxa"/>
+            <w:tcW w:w="1354" w:type="dxa"/>
             <w:tcBorders>
               <w:start w:val="single" w:sz="4" w:space="0" w:color="000000"/>
               <w:bottom w:val="single" w:sz="4" w:space="0" w:color="000000"/>
@@ -21637,7 +23163,7 @@
         </w:tc>
         <w:tc>
           <w:tcPr>
-            <w:tcW w:w="2931" w:type="dxa"/>
+            <w:tcW w:w="2930" w:type="dxa"/>
             <w:tcBorders>
               <w:start w:val="single" w:sz="4" w:space="0" w:color="000000"/>
               <w:bottom w:val="single" w:sz="4" w:space="0" w:color="000000"/>
@@ -21748,7 +23274,7 @@
         </w:tc>
         <w:tc>
           <w:tcPr>
-            <w:tcW w:w="1353" w:type="dxa"/>
+            <w:tcW w:w="1354" w:type="dxa"/>
             <w:tcBorders>
               <w:start w:val="single" w:sz="4" w:space="0" w:color="000000"/>
               <w:bottom w:val="single" w:sz="4" w:space="0" w:color="000000"/>
@@ -21893,7 +23419,7 @@
         </w:tc>
         <w:tc>
           <w:tcPr>
-            <w:tcW w:w="2931" w:type="dxa"/>
+            <w:tcW w:w="2930" w:type="dxa"/>
             <w:tcBorders>
               <w:start w:val="single" w:sz="4" w:space="0" w:color="000000"/>
               <w:bottom w:val="single" w:sz="4" w:space="0" w:color="000000"/>
@@ -21987,7 +23513,7 @@
         </w:tc>
         <w:tc>
           <w:tcPr>
-            <w:tcW w:w="1353" w:type="dxa"/>
+            <w:tcW w:w="1354" w:type="dxa"/>
             <w:tcBorders>
               <w:start w:val="single" w:sz="4" w:space="0" w:color="000000"/>
               <w:bottom w:val="single" w:sz="4" w:space="0" w:color="000000"/>
@@ -22132,7 +23658,7 @@
         </w:tc>
         <w:tc>
           <w:tcPr>
-            <w:tcW w:w="2931" w:type="dxa"/>
+            <w:tcW w:w="2930" w:type="dxa"/>
             <w:tcBorders>
               <w:start w:val="single" w:sz="4" w:space="0" w:color="000000"/>
               <w:bottom w:val="single" w:sz="4" w:space="0" w:color="000000"/>
@@ -22226,7 +23752,7 @@
         </w:tc>
         <w:tc>
           <w:tcPr>
-            <w:tcW w:w="1353" w:type="dxa"/>
+            <w:tcW w:w="1354" w:type="dxa"/>
             <w:tcBorders>
               <w:start w:val="single" w:sz="4" w:space="0" w:color="000000"/>
               <w:bottom w:val="single" w:sz="4" w:space="0" w:color="000000"/>
@@ -22372,7 +23898,7 @@
         </w:tc>
         <w:tc>
           <w:tcPr>
-            <w:tcW w:w="2931" w:type="dxa"/>
+            <w:tcW w:w="2930" w:type="dxa"/>
             <w:tcBorders>
               <w:start w:val="single" w:sz="4" w:space="0" w:color="000000"/>
               <w:bottom w:val="single" w:sz="4" w:space="0" w:color="000000"/>
@@ -22466,7 +23992,7 @@
         </w:tc>
         <w:tc>
           <w:tcPr>
-            <w:tcW w:w="1353" w:type="dxa"/>
+            <w:tcW w:w="1354" w:type="dxa"/>
             <w:tcBorders>
               <w:start w:val="single" w:sz="4" w:space="0" w:color="000000"/>
               <w:bottom w:val="single" w:sz="4" w:space="0" w:color="000000"/>
@@ -22611,7 +24137,7 @@
         </w:tc>
         <w:tc>
           <w:tcPr>
-            <w:tcW w:w="2931" w:type="dxa"/>
+            <w:tcW w:w="2930" w:type="dxa"/>
             <w:tcBorders>
               <w:start w:val="single" w:sz="4" w:space="0" w:color="000000"/>
               <w:bottom w:val="single" w:sz="4" w:space="0" w:color="000000"/>
@@ -22705,7 +24231,7 @@
         </w:tc>
         <w:tc>
           <w:tcPr>
-            <w:tcW w:w="1353" w:type="dxa"/>
+            <w:tcW w:w="1354" w:type="dxa"/>
             <w:tcBorders>
               <w:start w:val="single" w:sz="4" w:space="0" w:color="000000"/>
               <w:bottom w:val="single" w:sz="4" w:space="0" w:color="000000"/>
@@ -22848,7 +24374,7 @@
         </w:tc>
         <w:tc>
           <w:tcPr>
-            <w:tcW w:w="2931" w:type="dxa"/>
+            <w:tcW w:w="2930" w:type="dxa"/>
             <w:tcBorders>
               <w:start w:val="single" w:sz="4" w:space="0" w:color="000000"/>
               <w:bottom w:val="single" w:sz="4" w:space="0" w:color="000000"/>
@@ -22959,7 +24485,7 @@
         </w:tc>
         <w:tc>
           <w:tcPr>
-            <w:tcW w:w="1353" w:type="dxa"/>
+            <w:tcW w:w="1354" w:type="dxa"/>
             <w:tcBorders>
               <w:start w:val="single" w:sz="4" w:space="0" w:color="000000"/>
               <w:bottom w:val="single" w:sz="4" w:space="0" w:color="000000"/>
@@ -23070,6 +24596,8 @@
         <w:ind w:hanging="0" w:start="0"/>
         <w:rPr/>
       </w:pPr>
+      <w:bookmarkStart w:id="11" w:name="__RefHeading___Toc2114_1783282664"/>
+      <w:bookmarkEnd w:id="11"/>
       <w:r>
         <w:rPr/>
         <w:t>Baseline restorer - fast</w:t>
@@ -23105,9 +24633,9 @@
         </w:tblCellMar>
       </w:tblPr>
       <w:tblGrid>
-        <w:gridCol w:w="1133"/>
+        <w:gridCol w:w="1132"/>
         <w:gridCol w:w="3516"/>
-        <w:gridCol w:w="1351"/>
+        <w:gridCol w:w="1352"/>
         <w:gridCol w:w="1350"/>
         <w:gridCol w:w="2622"/>
       </w:tblGrid>
@@ -23115,7 +24643,7 @@
         <w:trPr/>
         <w:tc>
           <w:tcPr>
-            <w:tcW w:w="1133" w:type="dxa"/>
+            <w:tcW w:w="1132" w:type="dxa"/>
             <w:tcBorders>
               <w:top w:val="single" w:sz="4" w:space="0" w:color="000000"/>
               <w:start w:val="single" w:sz="4" w:space="0" w:color="000000"/>
@@ -23189,7 +24717,7 @@
         </w:tc>
         <w:tc>
           <w:tcPr>
-            <w:tcW w:w="1351" w:type="dxa"/>
+            <w:tcW w:w="1352" w:type="dxa"/>
             <w:tcBorders>
               <w:top w:val="single" w:sz="4" w:space="0" w:color="000000"/>
               <w:start w:val="single" w:sz="4" w:space="0" w:color="000000"/>
@@ -23304,7 +24832,7 @@
         <w:trPr/>
         <w:tc>
           <w:tcPr>
-            <w:tcW w:w="1133" w:type="dxa"/>
+            <w:tcW w:w="1132" w:type="dxa"/>
             <w:tcBorders>
               <w:start w:val="single" w:sz="4" w:space="0" w:color="000000"/>
               <w:bottom w:val="single" w:sz="4" w:space="0" w:color="000000"/>
@@ -23398,7 +24926,7 @@
         </w:tc>
         <w:tc>
           <w:tcPr>
-            <w:tcW w:w="1351" w:type="dxa"/>
+            <w:tcW w:w="1352" w:type="dxa"/>
             <w:tcBorders>
               <w:start w:val="single" w:sz="4" w:space="0" w:color="000000"/>
               <w:bottom w:val="single" w:sz="4" w:space="0" w:color="000000"/>
@@ -23595,7 +25123,7 @@
         <w:trPr/>
         <w:tc>
           <w:tcPr>
-            <w:tcW w:w="1133" w:type="dxa"/>
+            <w:tcW w:w="1132" w:type="dxa"/>
             <w:tcBorders>
               <w:start w:val="single" w:sz="4" w:space="0" w:color="000000"/>
               <w:bottom w:val="single" w:sz="4" w:space="0" w:color="000000"/>
@@ -24233,7 +25761,7 @@
         </w:tc>
         <w:tc>
           <w:tcPr>
-            <w:tcW w:w="1351" w:type="dxa"/>
+            <w:tcW w:w="1352" w:type="dxa"/>
             <w:tcBorders>
               <w:start w:val="single" w:sz="4" w:space="0" w:color="000000"/>
               <w:bottom w:val="single" w:sz="4" w:space="0" w:color="000000"/>
@@ -24454,7 +25982,7 @@
         <w:trPr/>
         <w:tc>
           <w:tcPr>
-            <w:tcW w:w="1133" w:type="dxa"/>
+            <w:tcW w:w="1132" w:type="dxa"/>
             <w:tcBorders>
               <w:start w:val="single" w:sz="4" w:space="0" w:color="000000"/>
               <w:bottom w:val="single" w:sz="4" w:space="0" w:color="000000"/>
@@ -24547,7 +26075,7 @@
         </w:tc>
         <w:tc>
           <w:tcPr>
-            <w:tcW w:w="1351" w:type="dxa"/>
+            <w:tcW w:w="1352" w:type="dxa"/>
             <w:tcBorders>
               <w:start w:val="single" w:sz="4" w:space="0" w:color="000000"/>
               <w:bottom w:val="single" w:sz="4" w:space="0" w:color="000000"/>
@@ -24692,7 +26220,7 @@
         <w:trPr/>
         <w:tc>
           <w:tcPr>
-            <w:tcW w:w="1133" w:type="dxa"/>
+            <w:tcW w:w="1132" w:type="dxa"/>
             <w:tcBorders>
               <w:start w:val="single" w:sz="4" w:space="0" w:color="000000"/>
               <w:bottom w:val="single" w:sz="4" w:space="0" w:color="000000"/>
@@ -24819,7 +26347,7 @@
         </w:tc>
         <w:tc>
           <w:tcPr>
-            <w:tcW w:w="1351" w:type="dxa"/>
+            <w:tcW w:w="1352" w:type="dxa"/>
             <w:tcBorders>
               <w:start w:val="single" w:sz="4" w:space="0" w:color="000000"/>
               <w:bottom w:val="single" w:sz="4" w:space="0" w:color="000000"/>
@@ -24964,7 +26492,7 @@
         <w:trPr/>
         <w:tc>
           <w:tcPr>
-            <w:tcW w:w="1133" w:type="dxa"/>
+            <w:tcW w:w="1132" w:type="dxa"/>
             <w:tcBorders>
               <w:start w:val="single" w:sz="4" w:space="0" w:color="000000"/>
               <w:bottom w:val="single" w:sz="4" w:space="0" w:color="000000"/>
@@ -25091,7 +26619,7 @@
         </w:tc>
         <w:tc>
           <w:tcPr>
-            <w:tcW w:w="1351" w:type="dxa"/>
+            <w:tcW w:w="1352" w:type="dxa"/>
             <w:tcBorders>
               <w:start w:val="single" w:sz="4" w:space="0" w:color="000000"/>
               <w:bottom w:val="single" w:sz="4" w:space="0" w:color="000000"/>
@@ -25249,6 +26777,8 @@
         <w:ind w:hanging="0" w:start="0"/>
         <w:rPr/>
       </w:pPr>
+      <w:bookmarkStart w:id="12" w:name="__RefHeading___Toc2116_1783282664"/>
+      <w:bookmarkEnd w:id="12"/>
       <w:r>
         <w:rPr/>
         <w:t>DCS – fast (deprecated)</w:t>
@@ -25303,8 +26833,8 @@
         <w:gridCol w:w="1678"/>
         <w:gridCol w:w="1800"/>
         <w:gridCol w:w="2522"/>
-        <w:gridCol w:w="1883"/>
-        <w:gridCol w:w="2089"/>
+        <w:gridCol w:w="1882"/>
+        <w:gridCol w:w="2090"/>
       </w:tblGrid>
       <w:tr>
         <w:trPr/>
@@ -25421,7 +26951,7 @@
         </w:tc>
         <w:tc>
           <w:tcPr>
-            <w:tcW w:w="1883" w:type="dxa"/>
+            <w:tcW w:w="1882" w:type="dxa"/>
             <w:tcBorders>
               <w:top w:val="single" w:sz="4" w:space="0" w:color="000000"/>
               <w:start w:val="single" w:sz="4" w:space="0" w:color="000000"/>
@@ -25458,7 +26988,7 @@
         </w:tc>
         <w:tc>
           <w:tcPr>
-            <w:tcW w:w="2089" w:type="dxa"/>
+            <w:tcW w:w="2090" w:type="dxa"/>
             <w:tcBorders>
               <w:top w:val="single" w:sz="4" w:space="0" w:color="000000"/>
               <w:start w:val="single" w:sz="4" w:space="0" w:color="000000"/>
@@ -25605,7 +27135,7 @@
         </w:tc>
         <w:tc>
           <w:tcPr>
-            <w:tcW w:w="1883" w:type="dxa"/>
+            <w:tcW w:w="1882" w:type="dxa"/>
             <w:tcBorders>
               <w:start w:val="single" w:sz="4" w:space="0" w:color="000000"/>
               <w:bottom w:val="single" w:sz="4" w:space="0" w:color="000000"/>
@@ -25641,7 +27171,7 @@
         </w:tc>
         <w:tc>
           <w:tcPr>
-            <w:tcW w:w="2089" w:type="dxa"/>
+            <w:tcW w:w="2090" w:type="dxa"/>
             <w:tcBorders>
               <w:start w:val="single" w:sz="4" w:space="0" w:color="000000"/>
               <w:bottom w:val="single" w:sz="4" w:space="0" w:color="000000"/>
@@ -25788,7 +27318,7 @@
         </w:tc>
         <w:tc>
           <w:tcPr>
-            <w:tcW w:w="1883" w:type="dxa"/>
+            <w:tcW w:w="1882" w:type="dxa"/>
             <w:tcBorders>
               <w:start w:val="single" w:sz="4" w:space="0" w:color="000000"/>
               <w:bottom w:val="single" w:sz="4" w:space="0" w:color="000000"/>
@@ -25824,7 +27354,7 @@
         </w:tc>
         <w:tc>
           <w:tcPr>
-            <w:tcW w:w="2089" w:type="dxa"/>
+            <w:tcW w:w="2090" w:type="dxa"/>
             <w:tcBorders>
               <w:start w:val="single" w:sz="4" w:space="0" w:color="000000"/>
               <w:bottom w:val="single" w:sz="4" w:space="0" w:color="000000"/>
@@ -25971,7 +27501,7 @@
         </w:tc>
         <w:tc>
           <w:tcPr>
-            <w:tcW w:w="1883" w:type="dxa"/>
+            <w:tcW w:w="1882" w:type="dxa"/>
             <w:tcBorders>
               <w:start w:val="single" w:sz="4" w:space="0" w:color="000000"/>
               <w:bottom w:val="single" w:sz="4" w:space="0" w:color="000000"/>
@@ -26007,7 +27537,7 @@
         </w:tc>
         <w:tc>
           <w:tcPr>
-            <w:tcW w:w="2089" w:type="dxa"/>
+            <w:tcW w:w="2090" w:type="dxa"/>
             <w:tcBorders>
               <w:start w:val="single" w:sz="4" w:space="0" w:color="000000"/>
               <w:bottom w:val="single" w:sz="4" w:space="0" w:color="000000"/>
@@ -26066,6 +27596,8 @@
         <w:ind w:hanging="0" w:start="0"/>
         <w:rPr/>
       </w:pPr>
+      <w:bookmarkStart w:id="13" w:name="__RefHeading___Toc2118_1783282664"/>
+      <w:bookmarkEnd w:id="13"/>
       <w:r>
         <w:rPr/>
         <w:t>Peak detector – fast</w:t>
@@ -26102,9 +27634,9 @@
       </w:tblPr>
       <w:tblGrid>
         <w:gridCol w:w="1678"/>
-        <w:gridCol w:w="2603"/>
+        <w:gridCol w:w="2602"/>
         <w:gridCol w:w="1800"/>
-        <w:gridCol w:w="1353"/>
+        <w:gridCol w:w="1354"/>
         <w:gridCol w:w="2538"/>
       </w:tblGrid>
       <w:tr>
@@ -26148,7 +27680,7 @@
         </w:tc>
         <w:tc>
           <w:tcPr>
-            <w:tcW w:w="2603" w:type="dxa"/>
+            <w:tcW w:w="2602" w:type="dxa"/>
             <w:tcBorders>
               <w:top w:val="single" w:sz="4" w:space="0" w:color="000000"/>
               <w:start w:val="single" w:sz="4" w:space="0" w:color="000000"/>
@@ -26222,7 +27754,7 @@
         </w:tc>
         <w:tc>
           <w:tcPr>
-            <w:tcW w:w="1353" w:type="dxa"/>
+            <w:tcW w:w="1354" w:type="dxa"/>
             <w:tcBorders>
               <w:top w:val="single" w:sz="4" w:space="0" w:color="000000"/>
               <w:start w:val="single" w:sz="4" w:space="0" w:color="000000"/>
@@ -26347,7 +27879,7 @@
         </w:tc>
         <w:tc>
           <w:tcPr>
-            <w:tcW w:w="2603" w:type="dxa"/>
+            <w:tcW w:w="2602" w:type="dxa"/>
             <w:tcBorders>
               <w:start w:val="single" w:sz="4" w:space="0" w:color="000000"/>
               <w:bottom w:val="single" w:sz="4" w:space="0" w:color="000000"/>
@@ -26509,7 +28041,7 @@
         </w:tc>
         <w:tc>
           <w:tcPr>
-            <w:tcW w:w="1353" w:type="dxa"/>
+            <w:tcW w:w="1354" w:type="dxa"/>
             <w:tcBorders>
               <w:start w:val="single" w:sz="4" w:space="0" w:color="000000"/>
               <w:bottom w:val="single" w:sz="4" w:space="0" w:color="000000"/>
@@ -26654,7 +28186,7 @@
         </w:tc>
         <w:tc>
           <w:tcPr>
-            <w:tcW w:w="2603" w:type="dxa"/>
+            <w:tcW w:w="2602" w:type="dxa"/>
             <w:tcBorders>
               <w:start w:val="single" w:sz="4" w:space="0" w:color="000000"/>
               <w:bottom w:val="single" w:sz="4" w:space="0" w:color="000000"/>
@@ -26758,7 +28290,7 @@
         </w:tc>
         <w:tc>
           <w:tcPr>
-            <w:tcW w:w="1353" w:type="dxa"/>
+            <w:tcW w:w="1354" w:type="dxa"/>
             <w:tcBorders>
               <w:start w:val="single" w:sz="4" w:space="0" w:color="000000"/>
               <w:bottom w:val="single" w:sz="4" w:space="0" w:color="000000"/>
@@ -26903,7 +28435,7 @@
         </w:tc>
         <w:tc>
           <w:tcPr>
-            <w:tcW w:w="2603" w:type="dxa"/>
+            <w:tcW w:w="2602" w:type="dxa"/>
             <w:tcBorders>
               <w:start w:val="single" w:sz="4" w:space="0" w:color="000000"/>
               <w:bottom w:val="single" w:sz="4" w:space="0" w:color="000000"/>
@@ -26991,56 +28523,7 @@
                 <w:b w:val="false"/>
                 <w:bCs w:val="false"/>
               </w:rPr>
-              <w:t>(</w:t>
-            </w:r>
-            <w:r>
-              <w:rPr>
-                <w:b w:val="false"/>
-                <w:bCs w:val="false"/>
-              </w:rPr>
-              <w:t>tau_pk_top</w:t>
-            </w:r>
-            <w:r>
-              <w:rPr>
-                <w:b w:val="false"/>
-                <w:bCs w:val="false"/>
-              </w:rPr>
-              <w:t>_fast</w:t>
-            </w:r>
-            <w:r>
-              <w:rPr>
-                <w:b w:val="false"/>
-                <w:bCs w:val="false"/>
-              </w:rPr>
-              <w:t xml:space="preserve"> + tot_factor*tau_pk</w:t>
-            </w:r>
-            <w:r>
-              <w:rPr>
-                <w:b w:val="false"/>
-                <w:bCs w:val="false"/>
-              </w:rPr>
-              <w:t>_fast</w:t>
-            </w:r>
-            <w:r>
-              <w:rPr>
-                <w:b w:val="false"/>
-                <w:bCs w:val="false"/>
-              </w:rPr>
-              <w:t>)/</w:t>
-            </w:r>
-            <w:r>
-              <w:rPr>
-                <w:b w:val="false"/>
-                <w:bCs w:val="false"/>
-              </w:rPr>
-              <w:t>T</w:t>
-            </w:r>
-            <w:r>
-              <w:rPr>
-                <w:b w:val="false"/>
-                <w:bCs w:val="false"/>
-              </w:rPr>
-              <w:t>clk</w:t>
+              <w:t>(tau_pk_top_fast + tot_factor*tau_pk_fast)/Tclk</w:t>
             </w:r>
           </w:p>
         </w:tc>
@@ -27093,7 +28576,7 @@
         </w:tc>
         <w:tc>
           <w:tcPr>
-            <w:tcW w:w="1353" w:type="dxa"/>
+            <w:tcW w:w="1354" w:type="dxa"/>
             <w:tcBorders>
               <w:start w:val="single" w:sz="4" w:space="0" w:color="000000"/>
               <w:bottom w:val="single" w:sz="4" w:space="0" w:color="000000"/>
@@ -27238,7 +28721,7 @@
         </w:tc>
         <w:tc>
           <w:tcPr>
-            <w:tcW w:w="2603" w:type="dxa"/>
+            <w:tcW w:w="2602" w:type="dxa"/>
             <w:tcBorders>
               <w:start w:val="single" w:sz="4" w:space="0" w:color="000000"/>
               <w:bottom w:val="single" w:sz="4" w:space="0" w:color="000000"/>
@@ -27325,7 +28808,7 @@
         </w:tc>
         <w:tc>
           <w:tcPr>
-            <w:tcW w:w="1353" w:type="dxa"/>
+            <w:tcW w:w="1354" w:type="dxa"/>
             <w:tcBorders>
               <w:start w:val="single" w:sz="4" w:space="0" w:color="000000"/>
               <w:bottom w:val="single" w:sz="4" w:space="0" w:color="000000"/>
@@ -27470,7 +28953,7 @@
         </w:tc>
         <w:tc>
           <w:tcPr>
-            <w:tcW w:w="2603" w:type="dxa"/>
+            <w:tcW w:w="2602" w:type="dxa"/>
             <w:tcBorders>
               <w:start w:val="single" w:sz="4" w:space="0" w:color="000000"/>
               <w:bottom w:val="single" w:sz="4" w:space="0" w:color="000000"/>
@@ -27573,7 +29056,7 @@
         </w:tc>
         <w:tc>
           <w:tcPr>
-            <w:tcW w:w="1353" w:type="dxa"/>
+            <w:tcW w:w="1354" w:type="dxa"/>
             <w:tcBorders>
               <w:start w:val="single" w:sz="4" w:space="0" w:color="000000"/>
               <w:bottom w:val="single" w:sz="4" w:space="0" w:color="000000"/>
@@ -27705,7 +29188,7 @@
         </w:tc>
         <w:tc>
           <w:tcPr>
-            <w:tcW w:w="2603" w:type="dxa"/>
+            <w:tcW w:w="2602" w:type="dxa"/>
             <w:tcBorders>
               <w:start w:val="single" w:sz="4" w:space="0" w:color="000000"/>
               <w:bottom w:val="single" w:sz="4" w:space="0" w:color="000000"/>
@@ -27799,7 +29282,7 @@
         </w:tc>
         <w:tc>
           <w:tcPr>
-            <w:tcW w:w="1353" w:type="dxa"/>
+            <w:tcW w:w="1354" w:type="dxa"/>
             <w:tcBorders>
               <w:start w:val="single" w:sz="4" w:space="0" w:color="000000"/>
               <w:bottom w:val="single" w:sz="4" w:space="0" w:color="000000"/>
@@ -27919,6 +29402,8 @@
         <w:ind w:hanging="0" w:start="0"/>
         <w:rPr/>
       </w:pPr>
+      <w:bookmarkStart w:id="14" w:name="__RefHeading___Toc2120_1783282664"/>
+      <w:bookmarkEnd w:id="14"/>
       <w:r>
         <w:rPr/>
         <w:t>Pileup rejector</w:t>
@@ -27955,9 +29440,9 @@
       </w:tblPr>
       <w:tblGrid>
         <w:gridCol w:w="1678"/>
-        <w:gridCol w:w="2603"/>
+        <w:gridCol w:w="2602"/>
         <w:gridCol w:w="1800"/>
-        <w:gridCol w:w="1353"/>
+        <w:gridCol w:w="1354"/>
         <w:gridCol w:w="2538"/>
       </w:tblGrid>
       <w:tr>
@@ -28001,7 +29486,7 @@
         </w:tc>
         <w:tc>
           <w:tcPr>
-            <w:tcW w:w="2603" w:type="dxa"/>
+            <w:tcW w:w="2602" w:type="dxa"/>
             <w:tcBorders>
               <w:top w:val="single" w:sz="4" w:space="0" w:color="000000"/>
               <w:start w:val="single" w:sz="4" w:space="0" w:color="000000"/>
@@ -28075,7 +29560,7 @@
         </w:tc>
         <w:tc>
           <w:tcPr>
-            <w:tcW w:w="1353" w:type="dxa"/>
+            <w:tcW w:w="1354" w:type="dxa"/>
             <w:tcBorders>
               <w:top w:val="single" w:sz="4" w:space="0" w:color="000000"/>
               <w:start w:val="single" w:sz="4" w:space="0" w:color="000000"/>
@@ -28200,7 +29685,7 @@
         </w:tc>
         <w:tc>
           <w:tcPr>
-            <w:tcW w:w="2603" w:type="dxa"/>
+            <w:tcW w:w="2602" w:type="dxa"/>
             <w:tcBorders>
               <w:start w:val="single" w:sz="4" w:space="0" w:color="000000"/>
               <w:bottom w:val="single" w:sz="4" w:space="0" w:color="000000"/>
@@ -28403,7 +29888,7 @@
         </w:tc>
         <w:tc>
           <w:tcPr>
-            <w:tcW w:w="1353" w:type="dxa"/>
+            <w:tcW w:w="1354" w:type="dxa"/>
             <w:tcBorders>
               <w:start w:val="single" w:sz="4" w:space="0" w:color="000000"/>
               <w:bottom w:val="single" w:sz="4" w:space="0" w:color="000000"/>
@@ -28548,7 +30033,7 @@
         </w:tc>
         <w:tc>
           <w:tcPr>
-            <w:tcW w:w="2603" w:type="dxa"/>
+            <w:tcW w:w="2602" w:type="dxa"/>
             <w:tcBorders>
               <w:start w:val="single" w:sz="4" w:space="0" w:color="000000"/>
               <w:bottom w:val="single" w:sz="4" w:space="0" w:color="000000"/>
@@ -28622,7 +30107,7 @@
         </w:tc>
         <w:tc>
           <w:tcPr>
-            <w:tcW w:w="1353" w:type="dxa"/>
+            <w:tcW w:w="1354" w:type="dxa"/>
             <w:tcBorders>
               <w:start w:val="single" w:sz="4" w:space="0" w:color="000000"/>
               <w:bottom w:val="single" w:sz="4" w:space="0" w:color="000000"/>
@@ -28767,7 +30252,7 @@
         </w:tc>
         <w:tc>
           <w:tcPr>
-            <w:tcW w:w="2603" w:type="dxa"/>
+            <w:tcW w:w="2602" w:type="dxa"/>
             <w:tcBorders>
               <w:start w:val="single" w:sz="4" w:space="0" w:color="000000"/>
               <w:bottom w:val="single" w:sz="4" w:space="0" w:color="000000"/>
@@ -28887,7 +30372,7 @@
         </w:tc>
         <w:tc>
           <w:tcPr>
-            <w:tcW w:w="1353" w:type="dxa"/>
+            <w:tcW w:w="1354" w:type="dxa"/>
             <w:tcBorders>
               <w:start w:val="single" w:sz="4" w:space="0" w:color="000000"/>
               <w:bottom w:val="single" w:sz="4" w:space="0" w:color="000000"/>
@@ -29004,6 +30489,8 @@
         <w:ind w:hanging="0" w:start="0"/>
         <w:rPr/>
       </w:pPr>
+      <w:bookmarkStart w:id="15" w:name="__RefHeading___Toc2122_1783282664"/>
+      <w:bookmarkEnd w:id="15"/>
       <w:r>
         <w:rPr/>
         <w:t>High Voltage (only for PMT version)</w:t>
@@ -29040,9 +30527,9 @@
       </w:tblPr>
       <w:tblGrid>
         <w:gridCol w:w="1678"/>
-        <w:gridCol w:w="2603"/>
+        <w:gridCol w:w="2602"/>
         <w:gridCol w:w="1800"/>
-        <w:gridCol w:w="1353"/>
+        <w:gridCol w:w="1354"/>
         <w:gridCol w:w="2538"/>
       </w:tblGrid>
       <w:tr>
@@ -29086,7 +30573,7 @@
         </w:tc>
         <w:tc>
           <w:tcPr>
-            <w:tcW w:w="2603" w:type="dxa"/>
+            <w:tcW w:w="2602" w:type="dxa"/>
             <w:tcBorders>
               <w:top w:val="single" w:sz="4" w:space="0" w:color="000000"/>
               <w:start w:val="single" w:sz="4" w:space="0" w:color="000000"/>
@@ -29160,7 +30647,7 @@
         </w:tc>
         <w:tc>
           <w:tcPr>
-            <w:tcW w:w="1353" w:type="dxa"/>
+            <w:tcW w:w="1354" w:type="dxa"/>
             <w:tcBorders>
               <w:top w:val="single" w:sz="4" w:space="0" w:color="000000"/>
               <w:start w:val="single" w:sz="4" w:space="0" w:color="000000"/>
@@ -29285,7 +30772,7 @@
         </w:tc>
         <w:tc>
           <w:tcPr>
-            <w:tcW w:w="2603" w:type="dxa"/>
+            <w:tcW w:w="2602" w:type="dxa"/>
             <w:tcBorders>
               <w:start w:val="single" w:sz="4" w:space="0" w:color="000000"/>
               <w:bottom w:val="single" w:sz="4" w:space="0" w:color="000000"/>
@@ -29578,7 +31065,7 @@
         </w:tc>
         <w:tc>
           <w:tcPr>
-            <w:tcW w:w="1353" w:type="dxa"/>
+            <w:tcW w:w="1354" w:type="dxa"/>
             <w:tcBorders>
               <w:start w:val="single" w:sz="4" w:space="0" w:color="000000"/>
               <w:bottom w:val="single" w:sz="4" w:space="0" w:color="000000"/>
@@ -29723,7 +31210,7 @@
         </w:tc>
         <w:tc>
           <w:tcPr>
-            <w:tcW w:w="2603" w:type="dxa"/>
+            <w:tcW w:w="2602" w:type="dxa"/>
             <w:tcBorders>
               <w:start w:val="single" w:sz="4" w:space="0" w:color="000000"/>
               <w:bottom w:val="single" w:sz="4" w:space="0" w:color="000000"/>
@@ -29854,7 +31341,7 @@
         </w:tc>
         <w:tc>
           <w:tcPr>
-            <w:tcW w:w="1353" w:type="dxa"/>
+            <w:tcW w:w="1354" w:type="dxa"/>
             <w:tcBorders>
               <w:start w:val="single" w:sz="4" w:space="0" w:color="000000"/>
               <w:bottom w:val="single" w:sz="4" w:space="0" w:color="000000"/>
@@ -30287,6 +31774,8 @@
         <w:ind w:hanging="0" w:start="0"/>
         <w:rPr/>
       </w:pPr>
+      <w:bookmarkStart w:id="16" w:name="__RefHeading___Toc2124_1783282664"/>
+      <w:bookmarkEnd w:id="16"/>
       <w:r>
         <w:rPr/>
         <w:t>Variable-gain analog amplifier</w:t>
@@ -30360,9 +31849,9 @@
       </w:tblPr>
       <w:tblGrid>
         <w:gridCol w:w="1678"/>
-        <w:gridCol w:w="2603"/>
+        <w:gridCol w:w="2602"/>
         <w:gridCol w:w="1800"/>
-        <w:gridCol w:w="1353"/>
+        <w:gridCol w:w="1354"/>
         <w:gridCol w:w="2538"/>
       </w:tblGrid>
       <w:tr>
@@ -30406,7 +31895,7 @@
         </w:tc>
         <w:tc>
           <w:tcPr>
-            <w:tcW w:w="2603" w:type="dxa"/>
+            <w:tcW w:w="2602" w:type="dxa"/>
             <w:tcBorders>
               <w:top w:val="single" w:sz="4" w:space="0" w:color="000000"/>
               <w:start w:val="single" w:sz="4" w:space="0" w:color="000000"/>
@@ -30480,7 +31969,7 @@
         </w:tc>
         <w:tc>
           <w:tcPr>
-            <w:tcW w:w="1353" w:type="dxa"/>
+            <w:tcW w:w="1354" w:type="dxa"/>
             <w:tcBorders>
               <w:top w:val="single" w:sz="4" w:space="0" w:color="000000"/>
               <w:start w:val="single" w:sz="4" w:space="0" w:color="000000"/>
@@ -30605,7 +32094,7 @@
         </w:tc>
         <w:tc>
           <w:tcPr>
-            <w:tcW w:w="2603" w:type="dxa"/>
+            <w:tcW w:w="2602" w:type="dxa"/>
             <w:tcBorders>
               <w:start w:val="single" w:sz="4" w:space="0" w:color="000000"/>
               <w:bottom w:val="single" w:sz="4" w:space="0" w:color="000000"/>
@@ -30887,7 +32376,7 @@
         </w:tc>
         <w:tc>
           <w:tcPr>
-            <w:tcW w:w="1353" w:type="dxa"/>
+            <w:tcW w:w="1354" w:type="dxa"/>
             <w:tcBorders>
               <w:start w:val="single" w:sz="4" w:space="0" w:color="000000"/>
               <w:bottom w:val="single" w:sz="4" w:space="0" w:color="000000"/>
@@ -31032,7 +32521,7 @@
         </w:tc>
         <w:tc>
           <w:tcPr>
-            <w:tcW w:w="2603" w:type="dxa"/>
+            <w:tcW w:w="2602" w:type="dxa"/>
             <w:tcBorders>
               <w:start w:val="single" w:sz="4" w:space="0" w:color="000000"/>
               <w:bottom w:val="single" w:sz="4" w:space="0" w:color="000000"/>
@@ -31320,7 +32809,7 @@
         </w:tc>
         <w:tc>
           <w:tcPr>
-            <w:tcW w:w="1353" w:type="dxa"/>
+            <w:tcW w:w="1354" w:type="dxa"/>
             <w:tcBorders>
               <w:start w:val="single" w:sz="4" w:space="0" w:color="000000"/>
               <w:bottom w:val="single" w:sz="4" w:space="0" w:color="000000"/>
@@ -31466,9 +32955,9 @@
       </w:tblPr>
       <w:tblGrid>
         <w:gridCol w:w="1678"/>
-        <w:gridCol w:w="2603"/>
+        <w:gridCol w:w="2602"/>
         <w:gridCol w:w="1800"/>
-        <w:gridCol w:w="1353"/>
+        <w:gridCol w:w="1354"/>
         <w:gridCol w:w="2538"/>
       </w:tblGrid>
       <w:tr>
@@ -31512,7 +33001,7 @@
         </w:tc>
         <w:tc>
           <w:tcPr>
-            <w:tcW w:w="2603" w:type="dxa"/>
+            <w:tcW w:w="2602" w:type="dxa"/>
             <w:tcBorders>
               <w:top w:val="single" w:sz="4" w:space="0" w:color="000000"/>
               <w:start w:val="single" w:sz="4" w:space="0" w:color="000000"/>
@@ -31586,7 +33075,7 @@
         </w:tc>
         <w:tc>
           <w:tcPr>
-            <w:tcW w:w="1353" w:type="dxa"/>
+            <w:tcW w:w="1354" w:type="dxa"/>
             <w:tcBorders>
               <w:top w:val="single" w:sz="4" w:space="0" w:color="000000"/>
               <w:start w:val="single" w:sz="4" w:space="0" w:color="000000"/>
@@ -31711,7 +33200,7 @@
         </w:tc>
         <w:tc>
           <w:tcPr>
-            <w:tcW w:w="2603" w:type="dxa"/>
+            <w:tcW w:w="2602" w:type="dxa"/>
             <w:tcBorders>
               <w:start w:val="single" w:sz="4" w:space="0" w:color="000000"/>
               <w:bottom w:val="single" w:sz="4" w:space="0" w:color="000000"/>
@@ -31993,7 +33482,7 @@
         </w:tc>
         <w:tc>
           <w:tcPr>
-            <w:tcW w:w="1353" w:type="dxa"/>
+            <w:tcW w:w="1354" w:type="dxa"/>
             <w:tcBorders>
               <w:start w:val="single" w:sz="4" w:space="0" w:color="000000"/>
               <w:bottom w:val="single" w:sz="4" w:space="0" w:color="000000"/>
@@ -32138,7 +33627,7 @@
         </w:tc>
         <w:tc>
           <w:tcPr>
-            <w:tcW w:w="2603" w:type="dxa"/>
+            <w:tcW w:w="2602" w:type="dxa"/>
             <w:tcBorders>
               <w:start w:val="single" w:sz="4" w:space="0" w:color="000000"/>
               <w:bottom w:val="single" w:sz="4" w:space="0" w:color="000000"/>
@@ -32426,7 +33915,7 @@
         </w:tc>
         <w:tc>
           <w:tcPr>
-            <w:tcW w:w="1353" w:type="dxa"/>
+            <w:tcW w:w="1354" w:type="dxa"/>
             <w:tcBorders>
               <w:start w:val="single" w:sz="4" w:space="0" w:color="000000"/>
               <w:bottom w:val="single" w:sz="4" w:space="0" w:color="000000"/>
@@ -32807,11 +34296,255 @@
       <w:rPr/>
     </w:lvl>
   </w:abstractNum>
+  <w:abstractNum w:abstractNumId="3">
+    <w:lvl w:ilvl="0">
+      <w:start w:val="1"/>
+      <w:numFmt w:val="decimal"/>
+      <w:lvlText w:val="%1."/>
+      <w:lvlJc w:val="start"/>
+      <w:pPr>
+        <w:tabs>
+          <w:tab w:val="num" w:pos="720"/>
+        </w:tabs>
+        <w:ind w:start="720" w:hanging="360"/>
+      </w:pPr>
+      <w:rPr/>
+    </w:lvl>
+    <w:lvl w:ilvl="1">
+      <w:start w:val="1"/>
+      <w:numFmt w:val="decimal"/>
+      <w:lvlText w:val="%2."/>
+      <w:lvlJc w:val="start"/>
+      <w:pPr>
+        <w:tabs>
+          <w:tab w:val="num" w:pos="1080"/>
+        </w:tabs>
+        <w:ind w:start="1080" w:hanging="360"/>
+      </w:pPr>
+      <w:rPr/>
+    </w:lvl>
+    <w:lvl w:ilvl="2">
+      <w:start w:val="1"/>
+      <w:numFmt w:val="decimal"/>
+      <w:lvlText w:val="%3."/>
+      <w:lvlJc w:val="start"/>
+      <w:pPr>
+        <w:tabs>
+          <w:tab w:val="num" w:pos="1440"/>
+        </w:tabs>
+        <w:ind w:start="1440" w:hanging="360"/>
+      </w:pPr>
+      <w:rPr/>
+    </w:lvl>
+    <w:lvl w:ilvl="3">
+      <w:start w:val="1"/>
+      <w:numFmt w:val="decimal"/>
+      <w:lvlText w:val="%4."/>
+      <w:lvlJc w:val="start"/>
+      <w:pPr>
+        <w:tabs>
+          <w:tab w:val="num" w:pos="1800"/>
+        </w:tabs>
+        <w:ind w:start="1800" w:hanging="360"/>
+      </w:pPr>
+      <w:rPr/>
+    </w:lvl>
+    <w:lvl w:ilvl="4">
+      <w:start w:val="1"/>
+      <w:numFmt w:val="decimal"/>
+      <w:lvlText w:val="%5."/>
+      <w:lvlJc w:val="start"/>
+      <w:pPr>
+        <w:tabs>
+          <w:tab w:val="num" w:pos="2160"/>
+        </w:tabs>
+        <w:ind w:start="2160" w:hanging="360"/>
+      </w:pPr>
+      <w:rPr/>
+    </w:lvl>
+    <w:lvl w:ilvl="5">
+      <w:start w:val="1"/>
+      <w:numFmt w:val="decimal"/>
+      <w:lvlText w:val="%6."/>
+      <w:lvlJc w:val="start"/>
+      <w:pPr>
+        <w:tabs>
+          <w:tab w:val="num" w:pos="2520"/>
+        </w:tabs>
+        <w:ind w:start="2520" w:hanging="360"/>
+      </w:pPr>
+      <w:rPr/>
+    </w:lvl>
+    <w:lvl w:ilvl="6">
+      <w:start w:val="1"/>
+      <w:numFmt w:val="decimal"/>
+      <w:lvlText w:val="%7."/>
+      <w:lvlJc w:val="start"/>
+      <w:pPr>
+        <w:tabs>
+          <w:tab w:val="num" w:pos="2880"/>
+        </w:tabs>
+        <w:ind w:start="2880" w:hanging="360"/>
+      </w:pPr>
+      <w:rPr/>
+    </w:lvl>
+    <w:lvl w:ilvl="7">
+      <w:start w:val="1"/>
+      <w:numFmt w:val="decimal"/>
+      <w:lvlText w:val="%8."/>
+      <w:lvlJc w:val="start"/>
+      <w:pPr>
+        <w:tabs>
+          <w:tab w:val="num" w:pos="3240"/>
+        </w:tabs>
+        <w:ind w:start="3240" w:hanging="360"/>
+      </w:pPr>
+      <w:rPr/>
+    </w:lvl>
+    <w:lvl w:ilvl="8">
+      <w:start w:val="1"/>
+      <w:numFmt w:val="decimal"/>
+      <w:lvlText w:val="%9."/>
+      <w:lvlJc w:val="start"/>
+      <w:pPr>
+        <w:tabs>
+          <w:tab w:val="num" w:pos="3600"/>
+        </w:tabs>
+        <w:ind w:start="3600" w:hanging="360"/>
+      </w:pPr>
+      <w:rPr/>
+    </w:lvl>
+  </w:abstractNum>
+  <w:abstractNum w:abstractNumId="4">
+    <w:lvl w:ilvl="0">
+      <w:start w:val="1"/>
+      <w:numFmt w:val="decimal"/>
+      <w:lvlText w:val="%1."/>
+      <w:lvlJc w:val="start"/>
+      <w:pPr>
+        <w:tabs>
+          <w:tab w:val="num" w:pos="720"/>
+        </w:tabs>
+        <w:ind w:start="720" w:hanging="360"/>
+      </w:pPr>
+      <w:rPr/>
+    </w:lvl>
+    <w:lvl w:ilvl="1">
+      <w:start w:val="1"/>
+      <w:numFmt w:val="decimal"/>
+      <w:lvlText w:val="%2."/>
+      <w:lvlJc w:val="start"/>
+      <w:pPr>
+        <w:tabs>
+          <w:tab w:val="num" w:pos="1080"/>
+        </w:tabs>
+        <w:ind w:start="1080" w:hanging="360"/>
+      </w:pPr>
+      <w:rPr/>
+    </w:lvl>
+    <w:lvl w:ilvl="2">
+      <w:start w:val="1"/>
+      <w:numFmt w:val="decimal"/>
+      <w:lvlText w:val="%3."/>
+      <w:lvlJc w:val="start"/>
+      <w:pPr>
+        <w:tabs>
+          <w:tab w:val="num" w:pos="1440"/>
+        </w:tabs>
+        <w:ind w:start="1440" w:hanging="360"/>
+      </w:pPr>
+      <w:rPr/>
+    </w:lvl>
+    <w:lvl w:ilvl="3">
+      <w:start w:val="1"/>
+      <w:numFmt w:val="decimal"/>
+      <w:lvlText w:val="%4."/>
+      <w:lvlJc w:val="start"/>
+      <w:pPr>
+        <w:tabs>
+          <w:tab w:val="num" w:pos="1800"/>
+        </w:tabs>
+        <w:ind w:start="1800" w:hanging="360"/>
+      </w:pPr>
+      <w:rPr/>
+    </w:lvl>
+    <w:lvl w:ilvl="4">
+      <w:start w:val="1"/>
+      <w:numFmt w:val="decimal"/>
+      <w:lvlText w:val="%5."/>
+      <w:lvlJc w:val="start"/>
+      <w:pPr>
+        <w:tabs>
+          <w:tab w:val="num" w:pos="2160"/>
+        </w:tabs>
+        <w:ind w:start="2160" w:hanging="360"/>
+      </w:pPr>
+      <w:rPr/>
+    </w:lvl>
+    <w:lvl w:ilvl="5">
+      <w:start w:val="1"/>
+      <w:numFmt w:val="decimal"/>
+      <w:lvlText w:val="%6."/>
+      <w:lvlJc w:val="start"/>
+      <w:pPr>
+        <w:tabs>
+          <w:tab w:val="num" w:pos="2520"/>
+        </w:tabs>
+        <w:ind w:start="2520" w:hanging="360"/>
+      </w:pPr>
+      <w:rPr/>
+    </w:lvl>
+    <w:lvl w:ilvl="6">
+      <w:start w:val="1"/>
+      <w:numFmt w:val="decimal"/>
+      <w:lvlText w:val="%7."/>
+      <w:lvlJc w:val="start"/>
+      <w:pPr>
+        <w:tabs>
+          <w:tab w:val="num" w:pos="2880"/>
+        </w:tabs>
+        <w:ind w:start="2880" w:hanging="360"/>
+      </w:pPr>
+      <w:rPr/>
+    </w:lvl>
+    <w:lvl w:ilvl="7">
+      <w:start w:val="1"/>
+      <w:numFmt w:val="decimal"/>
+      <w:lvlText w:val="%8."/>
+      <w:lvlJc w:val="start"/>
+      <w:pPr>
+        <w:tabs>
+          <w:tab w:val="num" w:pos="3240"/>
+        </w:tabs>
+        <w:ind w:start="3240" w:hanging="360"/>
+      </w:pPr>
+      <w:rPr/>
+    </w:lvl>
+    <w:lvl w:ilvl="8">
+      <w:start w:val="1"/>
+      <w:numFmt w:val="decimal"/>
+      <w:lvlText w:val="%9."/>
+      <w:lvlJc w:val="start"/>
+      <w:pPr>
+        <w:tabs>
+          <w:tab w:val="num" w:pos="3600"/>
+        </w:tabs>
+        <w:ind w:start="3600" w:hanging="360"/>
+      </w:pPr>
+      <w:rPr/>
+    </w:lvl>
+  </w:abstractNum>
   <w:num w:numId="1">
     <w:abstractNumId w:val="1"/>
   </w:num>
   <w:num w:numId="2">
     <w:abstractNumId w:val="2"/>
+  </w:num>
+  <w:num w:numId="3">
+    <w:abstractNumId w:val="3"/>
+  </w:num>
+  <w:num w:numId="4">
+    <w:abstractNumId w:val="4"/>
   </w:num>
 </w:numbering>
 </file>
@@ -32935,6 +34668,18 @@
       <w:sz w:val="26"/>
       <w:szCs w:val="26"/>
     </w:rPr>
+  </w:style>
+  <w:style w:type="character" w:styleId="Bullets">
+    <w:name w:val="Bullets"/>
+    <w:qFormat/>
+    <w:rPr>
+      <w:rFonts w:ascii="OpenSymbol" w:hAnsi="OpenSymbol" w:eastAsia="OpenSymbol" w:cs="OpenSymbol"/>
+    </w:rPr>
+  </w:style>
+  <w:style w:type="character" w:styleId="NumberingSymbols">
+    <w:name w:val="Numbering Symbols"/>
+    <w:qFormat/>
+    <w:rPr/>
   </w:style>
   <w:style w:type="paragraph" w:styleId="Heading">
     <w:name w:val="Heading"/>

</xml_diff>